<commit_message>
Shorten wood exam to 30-minute open-book format
</commit_message>
<xml_diff>
--- a/lehrkraft-material/pruefung/erwartungshorizont.docx
+++ b/lehrkraft-material/pruefung/erwartungshorizont.docx
@@ -12,12 +12,10 @@
     </w:p>
     <w:p>
       <w:r>
-        <w:t>Zur Lernerfolgskontrolle mit sieben Aufgabenblöcken und 60 Minuten Bearbeitungszeit. Teilaufgabe a erfasst den Mindeststandard, b den Regelstandard und c den Expertenstandard.</w:t>
-      </w:r>
-    </w:p>
-    <w:p>
-      <w:r>
-        <w:t>Die Standards bauen fachlich aufeinander auf. Sie beschreiben einzelne Kompetenzen, keine festen Schülergruppen. Alle Kinder dürfen alle Teilaufgaben bearbeiten. Expertenaufgaben zählen hier zur Kontrolle; sie sind nicht die freiwilligen Vertiefungen des Lernwegs.</w:t>
+        <w:rPr>
+          <w:b w:val="0"/>
+        </w:rPr>
+        <w:t>Zur vierseitigen Lernerfolgskontrolle mit 30 Minuten Arbeitszeit und 30 Punkten. Erlaubt ist das gedruckte Material der Mappe. iPad und andere digitale Geräte sind ausgeschlossen.</w:t>
       </w:r>
     </w:p>
     <w:p>
@@ -25,12 +23,15 @@
         <w:pStyle w:val="Heading2"/>
       </w:pPr>
       <w:r>
-        <w:t>Durchführung</w:t>
+        <w:t>Durchführung und Zeitplanung</w:t>
       </w:r>
     </w:p>
     <w:p>
       <w:r>
-        <w:t>Sieben Aufgabenblätter ausgeben. Etwa 50 Minuten für Aufgaben und 10 Minuten zum Lesen und Prüfen vorsehen. Mappe und Apps bleiben geschlossen. Die Materialauszüge auf dem Blatt sind erlaubt. Nachteilsausgleiche wie vereinbart berücksichtigen. Zeiten sind Planwerte und nach dem ersten Einsatz zu prüfen.</w:t>
+        <w:rPr>
+          <w:b w:val="0"/>
+        </w:rPr>
+        <w:t>Die vier Seiten gemeinsam ausgeben. Orientierung: Aufgaben 1 und 2 etwa 7 Minuten, 3 und 4 etwa 8 Minuten, 5 und 6 etwa 7 Minuten, Aufgabe 7 etwa 5 Minuten, abschließende Kontrolle etwa 3 Minuten. Das Nachschlagen ist in diesen Planwerten enthalten; nach dem ersten Einsatz prüfen. Vereinbarte Nachteilsausgleiche beachten.</w:t>
       </w:r>
     </w:p>
     <w:p>
@@ -38,22 +39,23 @@
         <w:pStyle w:val="Heading2"/>
       </w:pPr>
       <w:r>
-        <w:t>Auswertung</w:t>
+        <w:t>Bewertung</w:t>
       </w:r>
     </w:p>
     <w:p>
       <w:r>
-        <w:t>Pro Teilaufgabe E = erreicht, T = teilweise erreicht, N = noch nicht erreicht eintragen. E bedeutet: Alle im Lösungsteil genannten Kernmerkmale sind enthalten. T bedeutet: Mindestens ein tragfähiger Bestandteil stimmt, aber die Antwort bleibt wesentlich unvollständig. N bedeutet: Kein tragfähiger Bestandteil, ein grundlegender Widerspruch oder keine Antwort. Bei Aufzählungen gelten die angegebenen Schwellen.</w:t>
+        <w:rPr>
+          <w:b w:val="0"/>
+        </w:rPr>
+        <w:t>Sinngemäße Lückenfüllungen anerkennen. Rechtschreibfehler nicht abziehen, sofern der Fachbegriff eindeutig ist. Jeder Teil wird getrennt bewertet. Ein falsches Kreuz in 4a verhindert nicht den Punkt für eine fachlich passende Begründung in 4b. Kein automatisch abgeleiteter Notenschlüssel.</w:t>
       </w:r>
     </w:p>
     <w:p>
       <w:r>
-        <w:t>Sinngemäße Antworten und fachlich passende Alternativen anerkennen. Rechtschreibung verändert den fachlichen Kompetenzstatus nicht, solange die Aussage verständlich bleibt. Folgefehler nicht mehrfach bewerten: Entscheidend ist auch die nachvollziehbare Begründung.</w:t>
-      </w:r>
-    </w:p>
-    <w:p>
-      <w:r>
-        <w:t>Die Standards nicht zu einer pauschalen Niveaustufe verrechnen. Höhere Leistungen bleiben sichtbar, auch wenn Grundlagen lückenhaft sind. Dieses Raster enthält bewusst keinen Notenschlüssel; eine gegebenenfalls erforderliche Benotung ist vor dem Einsatz gesondert festzulegen.</w:t>
+        <w:rPr>
+          <w:b w:val="0"/>
+        </w:rPr>
+        <w:t>Einfachauswahl: Nur das richtige und kein weiteres Feld angekreuzt ergibt die genannten Punkte. Mehrfachauswahl 2c und 4c: je richtig gesetztem Kreuz 1 Punkt, je falsch gesetztem Kreuz 1 Punkt Abzug innerhalb der Teilaufgabe; mindestens 0, höchstens 2 Punkte. Nicht gesetzte Kreuze geben keine Punkte. Ein vollständig leeres Feld ergibt 0 Punkte. So wird nicht wahlloses Ankreuzen belohnt.</w:t>
       </w:r>
     </w:p>
     <w:p>
@@ -61,12 +63,71 @@
         <w:pStyle w:val="Heading2"/>
       </w:pPr>
       <w:r>
-        <w:t>Ablage vor Reihenbeginn</w:t>
+        <w:t>Lösungen zu Aufgaben 1 bis 4</w:t>
+      </w:r>
+    </w:p>
+    <w:p>
+      <w:pPr>
+        <w:pStyle w:val="Heading2"/>
+      </w:pPr>
+      <w:r>
+        <w:t>1 Aufbau des Stamms   4 Punkte</w:t>
       </w:r>
     </w:p>
     <w:p>
       <w:r>
-        <w:t>Prüfung und Lösungen liegen vorläufig im öffentlichen Lehrkraft-Cockpit. Vor Reihenbeginn in das vorgesehene geschützte Dateisystem übertragen und die öffentlichen Dateien sowie Links entfernen. Auch Generator, ZIP-Paket und Abbildungen gehören zum Prüfungspaket. Bereits veröffentlichte Git-Versionen und frühere Deployments bleiben möglicherweise erreichbar. Für eine vertrauliche Prüfung daher vor dem Einsatz eine neue Aufgabenvariante ausschließlich im geschützten System erstellen.</w:t>
+        <w:rPr>
+          <w:b w:val="0"/>
+        </w:rPr>
+        <w:t>1a Kambium; Splintholz: je 1 P. 1b Erste Aussage: Die Wurzeln bekommen zu wenig Zucker aus den Blättern; 2 P bei eindeutiger Auswahl. Die Störung des Zuckertransports wird aus der Funktion des Basts abgeleitet.</w:t>
+      </w:r>
+    </w:p>
+    <w:p>
+      <w:pPr>
+        <w:pStyle w:val="Heading2"/>
+      </w:pPr>
+      <w:r>
+        <w:t>2 Jahresringe   4 Punkte</w:t>
+      </w:r>
+    </w:p>
+    <w:p>
+      <w:r>
+        <w:rPr>
+          <w:b w:val="0"/>
+        </w:rPr>
+        <w:t>2a 12 Jahre: 1 P. 2b Erste Aussage (geringerer Dickenzuwachs): 1 P. 2c Erste und dritte Aussage: Wassermangel ist möglich, andere Ursachen kommen ebenfalls infrage; bis 2 P nach Mehrfachregel.</w:t>
+      </w:r>
+    </w:p>
+    <w:p>
+      <w:pPr>
+        <w:pStyle w:val="Heading2"/>
+      </w:pPr>
+      <w:r>
+        <w:t>3 Produktionsweg und Schnittplan   6 Punkte</w:t>
+      </w:r>
+    </w:p>
+    <w:p>
+      <w:r>
+        <w:rPr>
+          <w:b w:val="0"/>
+        </w:rPr>
+        <w:t>3a In der gedruckten Reihenfolge: 3, 6, 1, 5, 2, 4. Je korrekt eingetragener Zahl 0,5 P, insgesamt 3 P. 3b Späne / Sägespäne: 1 P. 3c Plan B: 1 P; 14 cm: 1 P. Die höhere Ausbeute von A genügt bei einer Mindestbreite von 12 cm nicht.</w:t>
+      </w:r>
+    </w:p>
+    <w:p>
+      <w:pPr>
+        <w:pStyle w:val="Heading2"/>
+      </w:pPr>
+      <w:r>
+        <w:t>4 Holzproben   4 Punkte</w:t>
+      </w:r>
+    </w:p>
+    <w:p>
+      <w:r>
+        <w:rPr>
+          <w:b w:val="0"/>
+        </w:rPr>
+        <w:t>4a Probe Q: 1 P. 4b kaum: 1 P. 4c Erste und dritte Aussage: Größere Masse kann durch größeres Volumen entstehen; gleiche Größe und ähnliche Trockenheit erlauben einen fairen Vergleich; bis 2 P nach Mehrfachregel.</w:t>
       </w:r>
     </w:p>
     <w:p>
@@ -79,32 +140,100 @@
         <w:pStyle w:val="Title"/>
       </w:pPr>
       <w:r>
-        <w:t>Kompetenzraster</w:t>
+        <w:t>Lösungen und Kompetenzbelege</w:t>
+      </w:r>
+    </w:p>
+    <w:p>
+      <w:pPr>
+        <w:pStyle w:val="Heading2"/>
+      </w:pPr>
+      <w:r>
+        <w:t>5 Holz arbeitet   4 Punkte</w:t>
+      </w:r>
+    </w:p>
+    <w:p>
+      <w:r>
+        <w:rPr>
+          <w:b w:val="0"/>
+        </w:rPr>
+        <w:t>5a Wasser; Schwinden: je 1 P. Auch „Feuchtigkeit“ bzw. „schwinden“ sinngemäß akzeptieren. 5b quellen / größer werden; Spiel / Platz / Abstand: je 1 P. Das Quellen kann zum Klemmen führen; die Bewegungsreserve ist eine passende Vorsorge.</w:t>
+      </w:r>
+    </w:p>
+    <w:p>
+      <w:pPr>
+        <w:pStyle w:val="Heading2"/>
+      </w:pPr>
+      <w:r>
+        <w:t>6 Holzfehler   4 Punkte</w:t>
+      </w:r>
+    </w:p>
+    <w:p>
+      <w:r>
+        <w:rPr>
+          <w:b w:val="0"/>
+        </w:rPr>
+        <w:t>6a A = 3, B = 1, C = 2: je 1 P. 6b Zweite Aussage: Lage und Nutzung entscheiden; 1 P bei eindeutiger Auswahl. Ein fest verwachsener Ast ist kein pauschaler Ausschussgrund.</w:t>
+      </w:r>
+    </w:p>
+    <w:p>
+      <w:pPr>
+        <w:pStyle w:val="Heading2"/>
+      </w:pPr>
+      <w:r>
+        <w:t>7 Materialentscheidung   4 Punkte</w:t>
+      </w:r>
+    </w:p>
+    <w:p>
+      <w:r>
+        <w:rPr>
+          <w:b w:val="0"/>
+        </w:rPr>
+        <w:t>7a Buche: 1 P. Nach Tabelle erfüllen Buche und Eiche Härte und glatte Bearbeitbarkeit; Buche ist von beiden preiswerter. 7b hart; glatt: je 1 P. 7c stark / deutlich: 1 P. Die Lückensätze werden unabhängig von 7a bewertet; kein mehrfacher Abzug eines Auswahlfehlers.</w:t>
+      </w:r>
+    </w:p>
+    <w:p>
+      <w:pPr>
+        <w:pStyle w:val="Heading2"/>
+      </w:pPr>
+      <w:r>
+        <w:t>Was die kurze Arbeit nachweisen kann</w:t>
+      </w:r>
+    </w:p>
+    <w:p>
+      <w:r>
+        <w:rPr>
+          <w:b w:val="0"/>
+        </w:rPr>
+        <w:t>Die geschlossene oder stark gestützte Antwortform prüft Verstehen und Anwenden mit wenig Schreibaufwand. Sie belegt keine frei formulierte ausführliche Erklärung. Die früheren 21 Teilaufgaben a bis c und deren Raster gelten für diese Fassung nicht mehr. Eine Gesamtpunktzahl wird deshalb nicht automatisch in einen Kompetenzstandard übersetzt.</w:t>
       </w:r>
     </w:p>
     <w:tbl>
       <w:tblPr>
-        <w:tblStyle w:val="TableGrid"/>
         <w:tblW w:type="dxa" w:w="9638"/>
         <w:jc w:val="left"/>
         <w:tblLayout w:type="fixed"/>
         <w:tblLook w:firstColumn="1" w:firstRow="1" w:lastColumn="0" w:lastRow="0" w:noHBand="0" w:noVBand="1" w:val="04A0"/>
-        <w:tblInd w:type="dxa" w:w="120"/>
+        <w:tblInd w:type="dxa" w:w="0"/>
       </w:tblPr>
       <w:tblGrid>
-        <w:gridCol w:w="1828"/>
-        <w:gridCol w:w="2326"/>
-        <w:gridCol w:w="2659"/>
-        <w:gridCol w:w="2825"/>
+        <w:gridCol w:w="2438"/>
+        <w:gridCol w:w="7200"/>
       </w:tblGrid>
       <w:tr>
         <w:trPr>
           <w:cantSplit/>
-          <w:tblHeader/>
         </w:trPr>
         <w:tc>
           <w:tcPr>
-            <w:tcW w:type="dxa" w:w="1828"/>
+            <w:tcW w:type="dxa" w:w="2438"/>
+            <w:vAlign w:val="center"/>
+            <w:tcBorders>
+              <w:top w:val="single" w:sz="5" w:color="D9D9D9"/>
+              <w:left w:val="single" w:sz="5" w:color="D9D9D9"/>
+              <w:bottom w:val="single" w:sz="5" w:color="D9D9D9"/>
+              <w:right w:val="single" w:sz="5" w:color="D9D9D9"/>
+            </w:tcBorders>
+            <w:shd w:fill="EEEEEE"/>
             <w:tcMar>
               <w:top w:w="80" w:type="dxa"/>
               <w:bottom w:w="80" w:type="dxa"/>
@@ -114,20 +243,28 @@
           </w:tcPr>
           <w:p>
             <w:pPr>
-              <w:spacing w:after="80" w:before="80" w:line="276" w:lineRule="auto"/>
+              <w:spacing w:before="60" w:after="60"/>
             </w:pPr>
             <w:r>
               <w:rPr>
                 <w:b/>
-                <w:sz w:val="22"/>
+                <w:sz w:val="21"/>
               </w:rPr>
-              <w:t>Kompetenz</w:t>
+              <w:t>Anforderung</w:t>
             </w:r>
           </w:p>
         </w:tc>
         <w:tc>
           <w:tcPr>
-            <w:tcW w:type="dxa" w:w="2326"/>
+            <w:tcW w:type="dxa" w:w="7200"/>
+            <w:vAlign w:val="center"/>
+            <w:tcBorders>
+              <w:top w:val="single" w:sz="5" w:color="D9D9D9"/>
+              <w:left w:val="single" w:sz="5" w:color="D9D9D9"/>
+              <w:bottom w:val="single" w:sz="5" w:color="D9D9D9"/>
+              <w:right w:val="single" w:sz="5" w:color="D9D9D9"/>
+            </w:tcBorders>
+            <w:shd w:fill="EEEEEE"/>
             <w:tcMar>
               <w:top w:w="80" w:type="dxa"/>
               <w:bottom w:w="80" w:type="dxa"/>
@@ -137,20 +274,32 @@
           </w:tcPr>
           <w:p>
             <w:pPr>
-              <w:spacing w:after="80" w:before="80" w:line="276" w:lineRule="auto"/>
+              <w:spacing w:before="60" w:after="60"/>
             </w:pPr>
             <w:r>
               <w:rPr>
                 <w:b/>
-                <w:sz w:val="22"/>
+                <w:sz w:val="21"/>
               </w:rPr>
-              <w:t>Mindeststandard a</w:t>
+              <w:t>Belege in dieser Arbeit</w:t>
             </w:r>
           </w:p>
         </w:tc>
+      </w:tr>
+      <w:tr>
+        <w:trPr>
+          <w:cantSplit/>
+        </w:trPr>
         <w:tc>
           <w:tcPr>
-            <w:tcW w:type="dxa" w:w="2659"/>
+            <w:tcW w:type="dxa" w:w="2438"/>
+            <w:vAlign w:val="center"/>
+            <w:tcBorders>
+              <w:top w:val="single" w:sz="5" w:color="D9D9D9"/>
+              <w:left w:val="single" w:sz="5" w:color="D9D9D9"/>
+              <w:bottom w:val="single" w:sz="5" w:color="D9D9D9"/>
+              <w:right w:val="single" w:sz="5" w:color="D9D9D9"/>
+            </w:tcBorders>
             <w:tcMar>
               <w:top w:w="80" w:type="dxa"/>
               <w:bottom w:w="80" w:type="dxa"/>
@@ -160,20 +309,27 @@
           </w:tcPr>
           <w:p>
             <w:pPr>
-              <w:spacing w:after="80" w:before="80" w:line="276" w:lineRule="auto"/>
+              <w:spacing w:before="60" w:after="60"/>
             </w:pPr>
             <w:r>
               <w:rPr>
-                <w:b/>
-                <w:sz w:val="22"/>
+                <w:b w:val="0"/>
+                <w:sz w:val="21"/>
               </w:rPr>
-              <w:t>Regelstandard b</w:t>
+              <w:t>Mindeststandard</w:t>
             </w:r>
           </w:p>
         </w:tc>
         <w:tc>
           <w:tcPr>
-            <w:tcW w:type="dxa" w:w="2825"/>
+            <w:tcW w:type="dxa" w:w="7200"/>
+            <w:vAlign w:val="center"/>
+            <w:tcBorders>
+              <w:top w:val="single" w:sz="5" w:color="D9D9D9"/>
+              <w:left w:val="single" w:sz="5" w:color="D9D9D9"/>
+              <w:bottom w:val="single" w:sz="5" w:color="D9D9D9"/>
+              <w:right w:val="single" w:sz="5" w:color="D9D9D9"/>
+            </w:tcBorders>
             <w:tcMar>
               <w:top w:w="80" w:type="dxa"/>
               <w:bottom w:w="80" w:type="dxa"/>
@@ -183,26 +339,32 @@
           </w:tcPr>
           <w:p>
             <w:pPr>
-              <w:spacing w:after="80" w:before="80" w:line="276" w:lineRule="auto"/>
+              <w:spacing w:before="60" w:after="60"/>
             </w:pPr>
             <w:r>
               <w:rPr>
-                <w:b/>
-                <w:sz w:val="22"/>
+                <w:b w:val="0"/>
+                <w:sz w:val="21"/>
               </w:rPr>
-              <w:t>Expertenstandard c</w:t>
+              <w:t>Funktionen ergänzen (1a), Ringe zählen (2a), Schritte ordnen (3a), Begriffe und Bilder zuordnen (6a)</w:t>
             </w:r>
           </w:p>
         </w:tc>
       </w:tr>
       <w:tr>
         <w:trPr>
-          <w:trHeight w:hRule="atLeast" w:val="1191"/>
           <w:cantSplit/>
         </w:trPr>
         <w:tc>
           <w:tcPr>
-            <w:tcW w:type="dxa" w:w="1828"/>
+            <w:tcW w:type="dxa" w:w="2438"/>
+            <w:vAlign w:val="center"/>
+            <w:tcBorders>
+              <w:top w:val="single" w:sz="5" w:color="D9D9D9"/>
+              <w:left w:val="single" w:sz="5" w:color="D9D9D9"/>
+              <w:bottom w:val="single" w:sz="5" w:color="D9D9D9"/>
+              <w:right w:val="single" w:sz="5" w:color="D9D9D9"/>
+            </w:tcBorders>
             <w:tcMar>
               <w:top w:w="80" w:type="dxa"/>
               <w:bottom w:w="80" w:type="dxa"/>
@@ -212,20 +374,27 @@
           </w:tcPr>
           <w:p>
             <w:pPr>
-              <w:spacing w:after="80" w:before="80" w:line="276" w:lineRule="auto"/>
+              <w:spacing w:before="60" w:after="60"/>
             </w:pPr>
             <w:r>
               <w:rPr>
                 <w:b w:val="0"/>
-                <w:sz w:val="22"/>
+                <w:sz w:val="21"/>
               </w:rPr>
-              <w:t>1 Stamm</w:t>
+              <w:t>Regelstandard</w:t>
             </w:r>
           </w:p>
         </w:tc>
         <w:tc>
           <w:tcPr>
-            <w:tcW w:type="dxa" w:w="2326"/>
+            <w:tcW w:type="dxa" w:w="7200"/>
+            <w:vAlign w:val="center"/>
+            <w:tcBorders>
+              <w:top w:val="single" w:sz="5" w:color="D9D9D9"/>
+              <w:left w:val="single" w:sz="5" w:color="D9D9D9"/>
+              <w:bottom w:val="single" w:sz="5" w:color="D9D9D9"/>
+              <w:right w:val="single" w:sz="5" w:color="D9D9D9"/>
+            </w:tcBorders>
             <w:tcMar>
               <w:top w:w="80" w:type="dxa"/>
               <w:bottom w:w="80" w:type="dxa"/>
@@ -235,20 +404,32 @@
           </w:tcPr>
           <w:p>
             <w:pPr>
-              <w:spacing w:after="80" w:before="80" w:line="276" w:lineRule="auto"/>
+              <w:spacing w:before="60" w:after="60"/>
             </w:pPr>
             <w:r>
               <w:rPr>
                 <w:b w:val="0"/>
-                <w:sz w:val="22"/>
+                <w:sz w:val="21"/>
               </w:rPr>
-              <w:t>Sechs Bereiche zuordnen</w:t>
+              <w:t>Ringbreite deuten (2b), Schnittbreite erklären (3b), Härte aus Druckspur ableiten (4a/b), Trocknungsdaten erklären (5a), Eigenschaften mit Auftrag verbinden (7b/c)</w:t>
             </w:r>
           </w:p>
         </w:tc>
+      </w:tr>
+      <w:tr>
+        <w:trPr>
+          <w:cantSplit/>
+        </w:trPr>
         <w:tc>
           <w:tcPr>
-            <w:tcW w:type="dxa" w:w="2659"/>
+            <w:tcW w:type="dxa" w:w="2438"/>
+            <w:vAlign w:val="center"/>
+            <w:tcBorders>
+              <w:top w:val="single" w:sz="5" w:color="D9D9D9"/>
+              <w:left w:val="single" w:sz="5" w:color="D9D9D9"/>
+              <w:bottom w:val="single" w:sz="5" w:color="D9D9D9"/>
+              <w:right w:val="single" w:sz="5" w:color="D9D9D9"/>
+            </w:tcBorders>
             <w:tcMar>
               <w:top w:w="80" w:type="dxa"/>
               <w:bottom w:w="80" w:type="dxa"/>
@@ -258,20 +439,27 @@
           </w:tcPr>
           <w:p>
             <w:pPr>
-              <w:spacing w:after="80" w:before="80" w:line="276" w:lineRule="auto"/>
+              <w:spacing w:before="60" w:after="60"/>
             </w:pPr>
             <w:r>
               <w:rPr>
                 <w:b w:val="0"/>
-                <w:sz w:val="22"/>
+                <w:sz w:val="21"/>
               </w:rPr>
-              <w:t>Kambium und Splintholz erklären</w:t>
+              <w:t>Expertenstandard</w:t>
             </w:r>
           </w:p>
         </w:tc>
         <w:tc>
           <w:tcPr>
-            <w:tcW w:type="dxa" w:w="2825"/>
+            <w:tcW w:type="dxa" w:w="7200"/>
+            <w:vAlign w:val="center"/>
+            <w:tcBorders>
+              <w:top w:val="single" w:sz="5" w:color="D9D9D9"/>
+              <w:left w:val="single" w:sz="5" w:color="D9D9D9"/>
+              <w:bottom w:val="single" w:sz="5" w:color="D9D9D9"/>
+              <w:right w:val="single" w:sz="5" w:color="D9D9D9"/>
+            </w:tcBorders>
             <w:tcMar>
               <w:top w:w="80" w:type="dxa"/>
               <w:bottom w:w="80" w:type="dxa"/>
@@ -281,602 +469,14 @@
           </w:tcPr>
           <w:p>
             <w:pPr>
-              <w:spacing w:after="80" w:before="80" w:line="276" w:lineRule="auto"/>
+              <w:spacing w:before="60" w:after="60"/>
             </w:pPr>
             <w:r>
               <w:rPr>
                 <w:b w:val="0"/>
-                <w:sz w:val="22"/>
+                <w:sz w:val="21"/>
               </w:rPr>
-              <w:t>Folge einer Bastschädigung erklären</w:t>
-            </w:r>
-          </w:p>
-        </w:tc>
-      </w:tr>
-      <w:tr>
-        <w:trPr>
-          <w:trHeight w:hRule="atLeast" w:val="1191"/>
-          <w:cantSplit/>
-        </w:trPr>
-        <w:tc>
-          <w:tcPr>
-            <w:tcW w:type="dxa" w:w="1828"/>
-            <w:tcMar>
-              <w:top w:w="80" w:type="dxa"/>
-              <w:bottom w:w="80" w:type="dxa"/>
-              <w:start w:w="120" w:type="dxa"/>
-              <w:end w:w="120" w:type="dxa"/>
-            </w:tcMar>
-          </w:tcPr>
-          <w:p>
-            <w:pPr>
-              <w:spacing w:after="80" w:before="80" w:line="276" w:lineRule="auto"/>
-            </w:pPr>
-            <w:r>
-              <w:rPr>
-                <w:b w:val="0"/>
-                <w:sz w:val="22"/>
-              </w:rPr>
-              <w:t>2 Jahresringe</w:t>
-            </w:r>
-          </w:p>
-        </w:tc>
-        <w:tc>
-          <w:tcPr>
-            <w:tcW w:type="dxa" w:w="2326"/>
-            <w:tcMar>
-              <w:top w:w="80" w:type="dxa"/>
-              <w:bottom w:w="80" w:type="dxa"/>
-              <w:start w:w="120" w:type="dxa"/>
-              <w:end w:w="120" w:type="dxa"/>
-            </w:tcMar>
-          </w:tcPr>
-          <w:p>
-            <w:pPr>
-              <w:spacing w:after="80" w:before="80" w:line="276" w:lineRule="auto"/>
-            </w:pPr>
-            <w:r>
-              <w:rPr>
-                <w:b w:val="0"/>
-                <w:sz w:val="22"/>
-              </w:rPr>
-              <w:t>Ringe zählen und Alter angeben</w:t>
-            </w:r>
-          </w:p>
-        </w:tc>
-        <w:tc>
-          <w:tcPr>
-            <w:tcW w:type="dxa" w:w="2659"/>
-            <w:tcMar>
-              <w:top w:w="80" w:type="dxa"/>
-              <w:bottom w:w="80" w:type="dxa"/>
-              <w:start w:w="120" w:type="dxa"/>
-              <w:end w:w="120" w:type="dxa"/>
-            </w:tcMar>
-          </w:tcPr>
-          <w:p>
-            <w:pPr>
-              <w:spacing w:after="80" w:before="80" w:line="276" w:lineRule="auto"/>
-            </w:pPr>
-            <w:r>
-              <w:rPr>
-                <w:b w:val="0"/>
-                <w:sz w:val="22"/>
-              </w:rPr>
-              <w:t>Ringbreite mit Wachstum verbinden</w:t>
-            </w:r>
-          </w:p>
-        </w:tc>
-        <w:tc>
-          <w:tcPr>
-            <w:tcW w:type="dxa" w:w="2825"/>
-            <w:tcMar>
-              <w:top w:w="80" w:type="dxa"/>
-              <w:bottom w:w="80" w:type="dxa"/>
-              <w:start w:w="120" w:type="dxa"/>
-              <w:end w:w="120" w:type="dxa"/>
-            </w:tcMar>
-          </w:tcPr>
-          <w:p>
-            <w:pPr>
-              <w:spacing w:after="80" w:before="80" w:line="276" w:lineRule="auto"/>
-            </w:pPr>
-            <w:r>
-              <w:rPr>
-                <w:b w:val="0"/>
-                <w:sz w:val="22"/>
-              </w:rPr>
-              <w:t>Ursache und sichere Aussage unterscheiden</w:t>
-            </w:r>
-          </w:p>
-        </w:tc>
-      </w:tr>
-      <w:tr>
-        <w:trPr>
-          <w:trHeight w:hRule="atLeast" w:val="1191"/>
-          <w:cantSplit/>
-        </w:trPr>
-        <w:tc>
-          <w:tcPr>
-            <w:tcW w:type="dxa" w:w="1828"/>
-            <w:tcMar>
-              <w:top w:w="80" w:type="dxa"/>
-              <w:bottom w:w="80" w:type="dxa"/>
-              <w:start w:w="120" w:type="dxa"/>
-              <w:end w:w="120" w:type="dxa"/>
-            </w:tcMar>
-          </w:tcPr>
-          <w:p>
-            <w:pPr>
-              <w:spacing w:after="80" w:before="80" w:line="276" w:lineRule="auto"/>
-            </w:pPr>
-            <w:r>
-              <w:rPr>
-                <w:b w:val="0"/>
-                <w:sz w:val="22"/>
-              </w:rPr>
-              <w:t>3 Produktionsweg</w:t>
-            </w:r>
-          </w:p>
-        </w:tc>
-        <w:tc>
-          <w:tcPr>
-            <w:tcW w:type="dxa" w:w="2326"/>
-            <w:tcMar>
-              <w:top w:w="80" w:type="dxa"/>
-              <w:bottom w:w="80" w:type="dxa"/>
-              <w:start w:w="120" w:type="dxa"/>
-              <w:end w:w="120" w:type="dxa"/>
-            </w:tcMar>
-          </w:tcPr>
-          <w:p>
-            <w:pPr>
-              <w:spacing w:after="80" w:before="80" w:line="276" w:lineRule="auto"/>
-            </w:pPr>
-            <w:r>
-              <w:rPr>
-                <w:b w:val="0"/>
-                <w:sz w:val="22"/>
-              </w:rPr>
-              <w:t>Sechs Schritte ordnen</w:t>
-            </w:r>
-          </w:p>
-        </w:tc>
-        <w:tc>
-          <w:tcPr>
-            <w:tcW w:type="dxa" w:w="2659"/>
-            <w:tcMar>
-              <w:top w:w="80" w:type="dxa"/>
-              <w:bottom w:w="80" w:type="dxa"/>
-              <w:start w:w="120" w:type="dxa"/>
-              <w:end w:w="120" w:type="dxa"/>
-            </w:tcMar>
-          </w:tcPr>
-          <w:p>
-            <w:pPr>
-              <w:spacing w:after="80" w:before="80" w:line="276" w:lineRule="auto"/>
-            </w:pPr>
-            <w:r>
-              <w:rPr>
-                <w:b w:val="0"/>
-                <w:sz w:val="22"/>
-              </w:rPr>
-              <w:t>Einschnitt und Verschnitt erklären</w:t>
-            </w:r>
-          </w:p>
-        </w:tc>
-        <w:tc>
-          <w:tcPr>
-            <w:tcW w:type="dxa" w:w="2825"/>
-            <w:tcMar>
-              <w:top w:w="80" w:type="dxa"/>
-              <w:bottom w:w="80" w:type="dxa"/>
-              <w:start w:w="120" w:type="dxa"/>
-              <w:end w:w="120" w:type="dxa"/>
-            </w:tcMar>
-          </w:tcPr>
-          <w:p>
-            <w:pPr>
-              <w:spacing w:after="80" w:before="80" w:line="276" w:lineRule="auto"/>
-            </w:pPr>
-            <w:r>
-              <w:rPr>
-                <w:b w:val="0"/>
-                <w:sz w:val="22"/>
-              </w:rPr>
-              <w:t>Ausbeute und Brettmaß abwägen</w:t>
-            </w:r>
-          </w:p>
-        </w:tc>
-      </w:tr>
-      <w:tr>
-        <w:trPr>
-          <w:trHeight w:hRule="atLeast" w:val="1191"/>
-          <w:cantSplit/>
-        </w:trPr>
-        <w:tc>
-          <w:tcPr>
-            <w:tcW w:type="dxa" w:w="1828"/>
-            <w:tcMar>
-              <w:top w:w="80" w:type="dxa"/>
-              <w:bottom w:w="80" w:type="dxa"/>
-              <w:start w:w="120" w:type="dxa"/>
-              <w:end w:w="120" w:type="dxa"/>
-            </w:tcMar>
-          </w:tcPr>
-          <w:p>
-            <w:pPr>
-              <w:spacing w:after="80" w:before="80" w:line="276" w:lineRule="auto"/>
-            </w:pPr>
-            <w:r>
-              <w:rPr>
-                <w:b w:val="0"/>
-                <w:sz w:val="22"/>
-              </w:rPr>
-              <w:t>4 Prüfen</w:t>
-            </w:r>
-          </w:p>
-        </w:tc>
-        <w:tc>
-          <w:tcPr>
-            <w:tcW w:type="dxa" w:w="2326"/>
-            <w:tcMar>
-              <w:top w:w="80" w:type="dxa"/>
-              <w:bottom w:w="80" w:type="dxa"/>
-              <w:start w:w="120" w:type="dxa"/>
-              <w:end w:w="120" w:type="dxa"/>
-            </w:tcMar>
-          </w:tcPr>
-          <w:p>
-            <w:pPr>
-              <w:spacing w:after="80" w:before="80" w:line="276" w:lineRule="auto"/>
-            </w:pPr>
-            <w:r>
-              <w:rPr>
-                <w:b w:val="0"/>
-                <w:sz w:val="22"/>
-              </w:rPr>
-              <w:t>Beobachtungen entnehmen</w:t>
-            </w:r>
-          </w:p>
-        </w:tc>
-        <w:tc>
-          <w:tcPr>
-            <w:tcW w:type="dxa" w:w="2659"/>
-            <w:tcMar>
-              <w:top w:w="80" w:type="dxa"/>
-              <w:bottom w:w="80" w:type="dxa"/>
-              <w:start w:w="120" w:type="dxa"/>
-              <w:end w:w="120" w:type="dxa"/>
-            </w:tcMar>
-          </w:tcPr>
-          <w:p>
-            <w:pPr>
-              <w:spacing w:after="80" w:before="80" w:line="276" w:lineRule="auto"/>
-            </w:pPr>
-            <w:r>
-              <w:rPr>
-                <w:b w:val="0"/>
-                <w:sz w:val="22"/>
-              </w:rPr>
-              <w:t>Härte aus Beobachtung ableiten</w:t>
-            </w:r>
-          </w:p>
-        </w:tc>
-        <w:tc>
-          <w:tcPr>
-            <w:tcW w:type="dxa" w:w="2825"/>
-            <w:tcMar>
-              <w:top w:w="80" w:type="dxa"/>
-              <w:bottom w:w="80" w:type="dxa"/>
-              <w:start w:w="120" w:type="dxa"/>
-              <w:end w:w="120" w:type="dxa"/>
-            </w:tcMar>
-          </w:tcPr>
-          <w:p>
-            <w:pPr>
-              <w:spacing w:after="80" w:before="80" w:line="276" w:lineRule="auto"/>
-            </w:pPr>
-            <w:r>
-              <w:rPr>
-                <w:b w:val="0"/>
-                <w:sz w:val="22"/>
-              </w:rPr>
-              <w:t>Vergleichsbedingungen beurteilen</w:t>
-            </w:r>
-          </w:p>
-        </w:tc>
-      </w:tr>
-      <w:tr>
-        <w:trPr>
-          <w:trHeight w:hRule="atLeast" w:val="1191"/>
-          <w:cantSplit/>
-        </w:trPr>
-        <w:tc>
-          <w:tcPr>
-            <w:tcW w:type="dxa" w:w="1828"/>
-            <w:tcMar>
-              <w:top w:w="80" w:type="dxa"/>
-              <w:bottom w:w="80" w:type="dxa"/>
-              <w:start w:w="120" w:type="dxa"/>
-              <w:end w:w="120" w:type="dxa"/>
-            </w:tcMar>
-          </w:tcPr>
-          <w:p>
-            <w:pPr>
-              <w:spacing w:after="80" w:before="80" w:line="276" w:lineRule="auto"/>
-            </w:pPr>
-            <w:r>
-              <w:rPr>
-                <w:b w:val="0"/>
-                <w:sz w:val="22"/>
-              </w:rPr>
-              <w:t>5 Holz arbeitet</w:t>
-            </w:r>
-          </w:p>
-        </w:tc>
-        <w:tc>
-          <w:tcPr>
-            <w:tcW w:type="dxa" w:w="2326"/>
-            <w:tcMar>
-              <w:top w:w="80" w:type="dxa"/>
-              <w:bottom w:w="80" w:type="dxa"/>
-              <w:start w:w="120" w:type="dxa"/>
-              <w:end w:w="120" w:type="dxa"/>
-            </w:tcMar>
-          </w:tcPr>
-          <w:p>
-            <w:pPr>
-              <w:spacing w:after="80" w:before="80" w:line="276" w:lineRule="auto"/>
-            </w:pPr>
-            <w:r>
-              <w:rPr>
-                <w:b w:val="0"/>
-                <w:sz w:val="22"/>
-              </w:rPr>
-              <w:t>Quellen und Schwinden benennen</w:t>
-            </w:r>
-          </w:p>
-        </w:tc>
-        <w:tc>
-          <w:tcPr>
-            <w:tcW w:type="dxa" w:w="2659"/>
-            <w:tcMar>
-              <w:top w:w="80" w:type="dxa"/>
-              <w:bottom w:w="80" w:type="dxa"/>
-              <w:start w:w="120" w:type="dxa"/>
-              <w:end w:w="120" w:type="dxa"/>
-            </w:tcMar>
-          </w:tcPr>
-          <w:p>
-            <w:pPr>
-              <w:spacing w:after="80" w:before="80" w:line="276" w:lineRule="auto"/>
-            </w:pPr>
-            <w:r>
-              <w:rPr>
-                <w:b w:val="0"/>
-                <w:sz w:val="22"/>
-              </w:rPr>
-              <w:t>Trocknungsdaten erklären</w:t>
-            </w:r>
-          </w:p>
-        </w:tc>
-        <w:tc>
-          <w:tcPr>
-            <w:tcW w:type="dxa" w:w="2825"/>
-            <w:tcMar>
-              <w:top w:w="80" w:type="dxa"/>
-              <w:bottom w:w="80" w:type="dxa"/>
-              <w:start w:w="120" w:type="dxa"/>
-              <w:end w:w="120" w:type="dxa"/>
-            </w:tcMar>
-          </w:tcPr>
-          <w:p>
-            <w:pPr>
-              <w:spacing w:after="80" w:before="80" w:line="276" w:lineRule="auto"/>
-            </w:pPr>
-            <w:r>
-              <w:rPr>
-                <w:b w:val="0"/>
-                <w:sz w:val="22"/>
-              </w:rPr>
-              <w:t>Problem und Vorsorge übertragen</w:t>
-            </w:r>
-          </w:p>
-        </w:tc>
-      </w:tr>
-      <w:tr>
-        <w:trPr>
-          <w:trHeight w:hRule="atLeast" w:val="1191"/>
-          <w:cantSplit/>
-        </w:trPr>
-        <w:tc>
-          <w:tcPr>
-            <w:tcW w:type="dxa" w:w="1828"/>
-            <w:tcMar>
-              <w:top w:w="80" w:type="dxa"/>
-              <w:bottom w:w="80" w:type="dxa"/>
-              <w:start w:w="120" w:type="dxa"/>
-              <w:end w:w="120" w:type="dxa"/>
-            </w:tcMar>
-          </w:tcPr>
-          <w:p>
-            <w:pPr>
-              <w:spacing w:after="80" w:before="80" w:line="276" w:lineRule="auto"/>
-            </w:pPr>
-            <w:r>
-              <w:rPr>
-                <w:b w:val="0"/>
-                <w:sz w:val="22"/>
-              </w:rPr>
-              <w:t>6 Holzfehler</w:t>
-            </w:r>
-          </w:p>
-        </w:tc>
-        <w:tc>
-          <w:tcPr>
-            <w:tcW w:type="dxa" w:w="2326"/>
-            <w:tcMar>
-              <w:top w:w="80" w:type="dxa"/>
-              <w:bottom w:w="80" w:type="dxa"/>
-              <w:start w:w="120" w:type="dxa"/>
-              <w:end w:w="120" w:type="dxa"/>
-            </w:tcMar>
-          </w:tcPr>
-          <w:p>
-            <w:pPr>
-              <w:spacing w:after="80" w:before="80" w:line="276" w:lineRule="auto"/>
-            </w:pPr>
-            <w:r>
-              <w:rPr>
-                <w:b w:val="0"/>
-                <w:sz w:val="22"/>
-              </w:rPr>
-              <w:t>Drei Fehler zuordnen</w:t>
-            </w:r>
-          </w:p>
-        </w:tc>
-        <w:tc>
-          <w:tcPr>
-            <w:tcW w:type="dxa" w:w="2659"/>
-            <w:tcMar>
-              <w:top w:w="80" w:type="dxa"/>
-              <w:bottom w:w="80" w:type="dxa"/>
-              <w:start w:w="120" w:type="dxa"/>
-              <w:end w:w="120" w:type="dxa"/>
-            </w:tcMar>
-          </w:tcPr>
-          <w:p>
-            <w:pPr>
-              <w:spacing w:after="80" w:before="80" w:line="276" w:lineRule="auto"/>
-            </w:pPr>
-            <w:r>
-              <w:rPr>
-                <w:b w:val="0"/>
-                <w:sz w:val="22"/>
-              </w:rPr>
-              <w:t>Technische Folge erklären</w:t>
-            </w:r>
-          </w:p>
-        </w:tc>
-        <w:tc>
-          <w:tcPr>
-            <w:tcW w:type="dxa" w:w="2825"/>
-            <w:tcMar>
-              <w:top w:w="80" w:type="dxa"/>
-              <w:bottom w:w="80" w:type="dxa"/>
-              <w:start w:w="120" w:type="dxa"/>
-              <w:end w:w="120" w:type="dxa"/>
-            </w:tcMar>
-          </w:tcPr>
-          <w:p>
-            <w:pPr>
-              <w:spacing w:after="80" w:before="80" w:line="276" w:lineRule="auto"/>
-            </w:pPr>
-            <w:r>
-              <w:rPr>
-                <w:b w:val="0"/>
-                <w:sz w:val="22"/>
-              </w:rPr>
-              <w:t>Verwendbarkeit abhängig vom Zweck beurteilen</w:t>
-            </w:r>
-          </w:p>
-        </w:tc>
-      </w:tr>
-      <w:tr>
-        <w:trPr>
-          <w:trHeight w:hRule="atLeast" w:val="1191"/>
-          <w:cantSplit/>
-        </w:trPr>
-        <w:tc>
-          <w:tcPr>
-            <w:tcW w:type="dxa" w:w="1828"/>
-            <w:tcMar>
-              <w:top w:w="80" w:type="dxa"/>
-              <w:bottom w:w="80" w:type="dxa"/>
-              <w:start w:w="120" w:type="dxa"/>
-              <w:end w:w="120" w:type="dxa"/>
-            </w:tcMar>
-          </w:tcPr>
-          <w:p>
-            <w:pPr>
-              <w:spacing w:after="80" w:before="80" w:line="276" w:lineRule="auto"/>
-            </w:pPr>
-            <w:r>
-              <w:rPr>
-                <w:b w:val="0"/>
-                <w:sz w:val="22"/>
-              </w:rPr>
-              <w:t>7 Beratung</w:t>
-            </w:r>
-          </w:p>
-        </w:tc>
-        <w:tc>
-          <w:tcPr>
-            <w:tcW w:type="dxa" w:w="2326"/>
-            <w:tcMar>
-              <w:top w:w="80" w:type="dxa"/>
-              <w:bottom w:w="80" w:type="dxa"/>
-              <w:start w:w="120" w:type="dxa"/>
-              <w:end w:w="120" w:type="dxa"/>
-            </w:tcMar>
-          </w:tcPr>
-          <w:p>
-            <w:pPr>
-              <w:spacing w:after="80" w:before="80" w:line="276" w:lineRule="auto"/>
-            </w:pPr>
-            <w:r>
-              <w:rPr>
-                <w:b w:val="0"/>
-                <w:sz w:val="22"/>
-              </w:rPr>
-              <w:t>Anforderungen erkennen</w:t>
-            </w:r>
-          </w:p>
-        </w:tc>
-        <w:tc>
-          <w:tcPr>
-            <w:tcW w:type="dxa" w:w="2659"/>
-            <w:tcMar>
-              <w:top w:w="80" w:type="dxa"/>
-              <w:bottom w:w="80" w:type="dxa"/>
-              <w:start w:w="120" w:type="dxa"/>
-              <w:end w:w="120" w:type="dxa"/>
-            </w:tcMar>
-          </w:tcPr>
-          <w:p>
-            <w:pPr>
-              <w:spacing w:after="80" w:before="80" w:line="276" w:lineRule="auto"/>
-            </w:pPr>
-            <w:r>
-              <w:rPr>
-                <w:b w:val="0"/>
-                <w:sz w:val="22"/>
-              </w:rPr>
-              <w:t>Materialwahl begründen</w:t>
-            </w:r>
-          </w:p>
-        </w:tc>
-        <w:tc>
-          <w:tcPr>
-            <w:tcW w:type="dxa" w:w="2825"/>
-            <w:tcMar>
-              <w:top w:w="80" w:type="dxa"/>
-              <w:bottom w:w="80" w:type="dxa"/>
-              <w:start w:w="120" w:type="dxa"/>
-              <w:end w:w="120" w:type="dxa"/>
-            </w:tcMar>
-          </w:tcPr>
-          <w:p>
-            <w:pPr>
-              <w:spacing w:after="80" w:before="80" w:line="276" w:lineRule="auto"/>
-            </w:pPr>
-            <w:r>
-              <w:rPr>
-                <w:b w:val="0"/>
-                <w:sz w:val="22"/>
-              </w:rPr>
-              <w:t>Alternativen anhand gleicher Kriterien abwägen</w:t>
+              <w:t>Folge einer Bastschädigung ableiten (1b), Grenze einer Aussage prüfen (2c), Mindestbreite gegen Ausbeute abwägen (3c), Vergleichsbedingungen prüfen (4c), Vorsorge übertragen (5b), Verwendbarkeit beurteilen (6b), mehrere Anforderungen abwägen (7a)</w:t>
             </w:r>
           </w:p>
         </w:tc>
@@ -884,188 +484,10 @@
     </w:tbl>
     <w:p>
       <w:r>
-        <w:t>Beleggrundlage: die jeweilige Teilaufgabe 1a bis 7c. Rückmeldung mit E, T oder N je Feld; keine automatische Gesamtstufe.</w:t>
-      </w:r>
-    </w:p>
-    <w:p>
-      <w:r>
-        <w:br w:type="page"/>
-      </w:r>
-    </w:p>
-    <w:p>
-      <w:pPr>
-        <w:pStyle w:val="Heading2"/>
-      </w:pPr>
-      <w:r>
-        <w:t>1 Aufbau des Stamms</w:t>
-      </w:r>
-    </w:p>
-    <w:p>
-      <w:r>
-        <w:t>a Mindeststandard: 1 Borke, 2 Bast, 3 Kambium, 4 Splintholz, 5 Kernholz, 6 Mark. E: sechs richtig; T: zwei bis fünf richtig; N: höchstens eine richtige Zuordnung.</w:t>
-      </w:r>
-    </w:p>
-    <w:p>
-      <w:r>
-        <w:t>b Regelstandard: Kambium bildet neue Zellen und ermöglicht Dickenwachstum. Splintholz transportiert Wasser und Mineralstoffe von den Wurzeln nach oben. E: beide Funktionen im Kern korrekt; T: nur eine Funktion korrekt oder beide erkennbar unvollständig.</w:t>
-      </w:r>
-    </w:p>
-    <w:p>
-      <w:r>
-        <w:t>c Expertenstandard: Der Bast transportiert Zucker aus den Blättern zu anderen Baumteilen. Eine ringförmige Unterbrechung beeinträchtigt die Versorgung, insbesondere der Wurzeln. E: Transportfunktion und Folge verbunden; T: Versorgungsschaden erkannt, aber Transport oder Zusammenhang unklar.</w:t>
-      </w:r>
-    </w:p>
-    <w:p>
-      <w:pPr>
-        <w:pStyle w:val="Heading2"/>
-      </w:pPr>
-      <w:r>
-        <w:t>2 Jahresringe lesen</w:t>
-      </w:r>
-    </w:p>
-    <w:p>
-      <w:r>
-        <w:t>a Mindeststandard: zwölf Jahresringe; ungefähr zwölf Jahre an dieser Schnittstelle. E: beides stimmt; T: Ringzählung mit einem Zählfehler und dazu passender Altersangabe oder nur eine der beiden Angaben.</w:t>
-      </w:r>
-    </w:p>
-    <w:p>
-      <w:r>
-        <w:t>b Regelstandard: Ring 8 zeigt geringeren Dickenzuwachs als die Nachbarringe. E: Dickenzuwachs und Vergleich genannt; T: nur allgemein „weniger gewachsen“. Keine Aussage über die Baumhöhe ableiten.</w:t>
-      </w:r>
-    </w:p>
-    <w:p>
-      <w:r>
-        <w:t>c Expertenstandard: Wassermangel ist möglich, aber nicht sicher aus der Ringbreite abzulesen. Auch Licht, Temperatur oder Konkurrenz kommen infrage. E: Unsicherheit begründet, etwa mit einer anderen Ursache; T: „nicht sicher“ oder mögliche andere Ursache ohne Erklärung.</w:t>
-      </w:r>
-    </w:p>
-    <w:p>
-      <w:r>
-        <w:br w:type="page"/>
-      </w:r>
-    </w:p>
-    <w:p>
-      <w:pPr>
-        <w:pStyle w:val="Heading2"/>
-      </w:pPr>
-      <w:r>
-        <w:t>3 Vom Baum zum Brett</w:t>
-      </w:r>
-    </w:p>
-    <w:p>
-      <w:r>
-        <w:t>a Mindeststandard: Baum → Fällen → Transport → Sägewerk → Einschnitt → Schnittholz. E: vollständig richtig; T: überwiegend sinnvolle Abfolge mit mindestens drei richtigen direkten Nachbarschaften; N: weniger.</w:t>
-      </w:r>
-    </w:p>
-    <w:p>
-      <w:r>
-        <w:t>b Regelstandard: Beim Einschnitt wird der Stamm aufgesägt. Runde Randbereiche und die Schnittbreite des Sägeblatts führen zu Material, das nicht zu den vorgesehenen Brettern wird. E: Vorgang und mindestens eine schlüssige Verschnittursache; T: nur eines davon.</w:t>
-      </w:r>
-    </w:p>
-    <w:p>
-      <w:r>
-        <w:t>c Expertenstandard: Plan B; 14 cm erfüllen die Mindestbreite von 12 cm, 9 cm bei A nicht. Die höhere Ausbeute von A hilft bei diesem Auftrag nicht. E: Wahl mit Maßvergleich und Abwägung; T: B mit nur einer passenden Begründung.</w:t>
-      </w:r>
-    </w:p>
-    <w:p>
-      <w:pPr>
-        <w:pStyle w:val="Heading2"/>
-      </w:pPr>
-      <w:r>
-        <w:t>4 Holz prüfen</w:t>
-      </w:r>
-    </w:p>
-    <w:p>
-      <w:r>
-        <w:t>a Mindeststandard: Q hat die größere Masse. P hat die deutlichere Druckspur. E: beides korrekt; T: eine Angabe korrekt.</w:t>
-      </w:r>
-    </w:p>
-    <w:p>
-      <w:r>
-        <w:t>b Regelstandard: Q ist im Versuch härter, weil die Münze kaum eine Spur hinterlässt. E: Eigenschaft und passende Beobachtung verbunden; T: Q ohne Begründung. Eine größere Masse allein begründet keine Härte.</w:t>
-      </w:r>
-    </w:p>
-    <w:p>
-      <w:r>
-        <w:t>c Expertenstandard: Die größere Probe kann allein wegen ihres Volumens mehr wiegen. Gleich große und ähnlich trockene Proben vergleichen; alternativ Dichte bei vergleichbarer Feuchte bestimmen. E: Problem und passende Verbesserung; T: nur Problem oder Verbesserung.</w:t>
-      </w:r>
-    </w:p>
-    <w:p>
-      <w:r>
-        <w:br w:type="page"/>
-      </w:r>
-    </w:p>
-    <w:p>
-      <w:pPr>
-        <w:pStyle w:val="Heading2"/>
-      </w:pPr>
-      <w:r>
-        <w:t>5 Quellen und Schwinden</w:t>
-      </w:r>
-    </w:p>
-    <w:p>
-      <w:r>
-        <w:t>a Mindeststandard: Quellen; Schwinden. E: beide Begriffe richtig; T: einer richtig.</w:t>
-      </w:r>
-    </w:p>
-    <w:p>
-      <w:r>
-        <w:t>b Regelstandard: Masse sinkt um 12 g, Breite um 1 mm. Wasserabgabe senkt die Masse; Wasserabgabe aus den Zellwänden kann Schwinden bewirken. E: beide Veränderungen mit zutreffender Erklärung; T: korrekte Veränderungen ohne Erklärung oder nur ein erklärter Zusammenhang. Die Zahlen der Differenzen sind nicht zwingend, wenn die Veränderungen eindeutig beschrieben sind.</w:t>
-      </w:r>
-    </w:p>
-    <w:p>
-      <w:r>
-        <w:t>c Expertenstandard: Aufnahme von Feuchtigkeit kann das Holz quellen lassen; dadurch kann die Schublade klemmen. Vorsorge: ausreichend Spiel für Bewegung oder passend getrocknetes Holz. E: Ursache, Klemmen und passende Vorsorge; T: nur Erklärung oder passende Vorsorge.</w:t>
-      </w:r>
-    </w:p>
-    <w:p>
-      <w:pPr>
-        <w:pStyle w:val="Heading2"/>
-      </w:pPr>
-      <w:r>
-        <w:t>6 Holzfehler beurteilen</w:t>
-      </w:r>
-    </w:p>
-    <w:p>
-      <w:r>
-        <w:t>a Mindeststandard: A Riss, B Ast, C Verwerfen. E: alle drei richtig; T: eine oder zwei richtige Zuordnungen.</w:t>
-      </w:r>
-    </w:p>
-    <w:p>
-      <w:r>
-        <w:t>b Regelstandard: Zum Beispiel Riss schwächt eine belastete Verbindung; verworfenes Brett liegt nicht plan auf; loser Ast kann herausfallen. E: Fehler, Produktbezug und konkrete technische Folge; T: plausible Folge ohne klaren Produktbezug. „Sieht schlecht aus“ allein genügt nicht.</w:t>
-      </w:r>
-    </w:p>
-    <w:p>
-      <w:r>
-        <w:t>c Expertenstandard: Nicht automatisch aussortieren. Ein fester Ast kann bei einer dekorativen Fläche akzeptabel sein; an einer belasteten Verbindung hängt die Eignung von Lage und Zustand ab. E: zweckbezogene Entscheidung mit Beispiel; T: bedingte Entscheidung ohne ausgeführtes Beispiel.</w:t>
-      </w:r>
-    </w:p>
-    <w:p>
-      <w:r>
-        <w:br w:type="page"/>
-      </w:r>
-    </w:p>
-    <w:p>
-      <w:pPr>
-        <w:pStyle w:val="Heading2"/>
-      </w:pPr>
-      <w:r>
-        <w:t>7 Holzberatung</w:t>
-      </w:r>
-    </w:p>
-    <w:p>
-      <w:r>
-        <w:t>a Mindeststandard: Zwei Anforderungen aus dem Auftrag, etwa harte und glatte Oberfläche oder Eignung für tägliche Nutzung. E: zwei passende Anforderungen; T: eine.</w:t>
-      </w:r>
-    </w:p>
-    <w:p>
-      <w:r>
-        <w:t>b Regelstandard: Beispiel Buche: hart gegen Druckspuren, feine gleichmäßige Struktur, gut glatt bearbeitbar. Nachteil: arbeitet bei wechselnder Feuchte. E: begründete Wahl mit drei passenden Eigenschaften und einem Nachteil; T: grundsätzlich passende Wahl, aber unvollständige Begründung. Eiche ist bei schlüssiger Begründung ebenfalls möglich; Fichte erfüllt die geforderte Härte nicht.</w:t>
-      </w:r>
-    </w:p>
-    <w:p>
-      <w:r>
-        <w:t>c Expertenstandard: Beispiel Buche und Fichte: Beide bearbeitbar; Buche ist härter, Fichte preiswerter. Für den häufigen Gebrauch ist hier die Härte wichtiger. E: zwei Holzarten anhand mindestens eines gemeinsamen Kriteriums verglichen und Entscheidung abgewogen; T: Unterschied genannt, aber nicht für den Auftrag abgewogen.</w:t>
+        <w:rPr>
+          <w:b w:val="0"/>
+        </w:rPr>
+        <w:t>Die Expertenbelege sind hier kurze, gestützte Entscheidungen. Für Aussagen über selbstständiges Argumentieren zusätzlich die Mappe oder ein Gespräch heranziehen.</w:t>
       </w:r>
     </w:p>
     <w:p>
@@ -1078,42 +500,53 @@
         <w:pStyle w:val="Title"/>
       </w:pPr>
       <w:r>
-        <w:t>Deine Rückmeldung</w:t>
+        <w:t>Individuelle Rückmeldung</w:t>
       </w:r>
     </w:p>
     <w:p>
       <w:r>
+        <w:rPr>
+          <w:b w:val="0"/>
+        </w:rPr>
         <w:t>Name: ____________________________  Datum: ______________</w:t>
       </w:r>
     </w:p>
     <w:p>
       <w:r>
-        <w:t>E = erreicht   T = teilweise erreicht   N = noch nicht erreicht</w:t>
+        <w:rPr>
+          <w:b w:val="0"/>
+        </w:rPr>
+        <w:t>Punkte: ______ / 30</w:t>
       </w:r>
     </w:p>
     <w:tbl>
       <w:tblPr>
-        <w:tblStyle w:val="TableGrid"/>
         <w:tblW w:type="dxa" w:w="9638"/>
         <w:jc w:val="left"/>
         <w:tblLayout w:type="fixed"/>
         <w:tblLook w:firstColumn="1" w:firstRow="1" w:lastColumn="0" w:lastRow="0" w:noHBand="0" w:noVBand="1" w:val="04A0"/>
-        <w:tblInd w:type="dxa" w:w="120"/>
+        <w:tblInd w:type="dxa" w:w="0"/>
       </w:tblPr>
       <w:tblGrid>
-        <w:gridCol w:w="2914"/>
-        <w:gridCol w:w="2241"/>
-        <w:gridCol w:w="2241"/>
-        <w:gridCol w:w="2242"/>
+        <w:gridCol w:w="4252"/>
+        <w:gridCol w:w="1417"/>
+        <w:gridCol w:w="3969"/>
       </w:tblGrid>
       <w:tr>
         <w:trPr>
           <w:cantSplit/>
-          <w:tblHeader/>
         </w:trPr>
         <w:tc>
           <w:tcPr>
-            <w:tcW w:type="dxa" w:w="2914"/>
+            <w:tcW w:type="dxa" w:w="4252"/>
+            <w:vAlign w:val="center"/>
+            <w:tcBorders>
+              <w:top w:val="single" w:sz="5" w:color="D9D9D9"/>
+              <w:left w:val="single" w:sz="5" w:color="D9D9D9"/>
+              <w:bottom w:val="single" w:sz="5" w:color="D9D9D9"/>
+              <w:right w:val="single" w:sz="5" w:color="D9D9D9"/>
+            </w:tcBorders>
+            <w:shd w:fill="EEEEEE"/>
             <w:tcMar>
               <w:top w:w="80" w:type="dxa"/>
               <w:bottom w:w="80" w:type="dxa"/>
@@ -1123,20 +556,28 @@
           </w:tcPr>
           <w:p>
             <w:pPr>
-              <w:spacing w:after="80" w:before="80" w:line="276" w:lineRule="auto"/>
+              <w:spacing w:before="60" w:after="60"/>
             </w:pPr>
             <w:r>
               <w:rPr>
                 <w:b/>
-                <w:sz w:val="22"/>
+                <w:sz w:val="21"/>
               </w:rPr>
-              <w:t>Kompetenz</w:t>
+              <w:t>Bereich</w:t>
             </w:r>
           </w:p>
         </w:tc>
         <w:tc>
           <w:tcPr>
-            <w:tcW w:type="dxa" w:w="2241"/>
+            <w:tcW w:type="dxa" w:w="1417"/>
+            <w:vAlign w:val="center"/>
+            <w:tcBorders>
+              <w:top w:val="single" w:sz="5" w:color="D9D9D9"/>
+              <w:left w:val="single" w:sz="5" w:color="D9D9D9"/>
+              <w:bottom w:val="single" w:sz="5" w:color="D9D9D9"/>
+              <w:right w:val="single" w:sz="5" w:color="D9D9D9"/>
+            </w:tcBorders>
+            <w:shd w:fill="EEEEEE"/>
             <w:tcMar>
               <w:top w:w="80" w:type="dxa"/>
               <w:bottom w:w="80" w:type="dxa"/>
@@ -1146,20 +587,28 @@
           </w:tcPr>
           <w:p>
             <w:pPr>
-              <w:spacing w:after="80" w:before="80" w:line="276" w:lineRule="auto"/>
+              <w:spacing w:before="60" w:after="60"/>
             </w:pPr>
             <w:r>
               <w:rPr>
                 <w:b/>
-                <w:sz w:val="22"/>
+                <w:sz w:val="21"/>
               </w:rPr>
-              <w:t>Mindeststandard</w:t>
+              <w:t>Punkte</w:t>
             </w:r>
           </w:p>
         </w:tc>
         <w:tc>
           <w:tcPr>
-            <w:tcW w:type="dxa" w:w="2241"/>
+            <w:tcW w:type="dxa" w:w="3969"/>
+            <w:vAlign w:val="center"/>
+            <w:tcBorders>
+              <w:top w:val="single" w:sz="5" w:color="D9D9D9"/>
+              <w:left w:val="single" w:sz="5" w:color="D9D9D9"/>
+              <w:bottom w:val="single" w:sz="5" w:color="D9D9D9"/>
+              <w:right w:val="single" w:sz="5" w:color="D9D9D9"/>
+            </w:tcBorders>
+            <w:shd w:fill="EEEEEE"/>
             <w:tcMar>
               <w:top w:w="80" w:type="dxa"/>
               <w:bottom w:w="80" w:type="dxa"/>
@@ -1169,20 +618,32 @@
           </w:tcPr>
           <w:p>
             <w:pPr>
-              <w:spacing w:after="80" w:before="80" w:line="276" w:lineRule="auto"/>
+              <w:spacing w:before="60" w:after="60"/>
             </w:pPr>
             <w:r>
               <w:rPr>
                 <w:b/>
-                <w:sz w:val="22"/>
+                <w:sz w:val="21"/>
               </w:rPr>
-              <w:t>Regelstandard</w:t>
+              <w:t>Dein nächster Übungsauftrag</w:t>
             </w:r>
           </w:p>
         </w:tc>
+      </w:tr>
+      <w:tr>
+        <w:trPr>
+          <w:cantSplit/>
+        </w:trPr>
         <w:tc>
           <w:tcPr>
-            <w:tcW w:type="dxa" w:w="2242"/>
+            <w:tcW w:type="dxa" w:w="4252"/>
+            <w:vAlign w:val="center"/>
+            <w:tcBorders>
+              <w:top w:val="single" w:sz="5" w:color="D9D9D9"/>
+              <w:left w:val="single" w:sz="5" w:color="D9D9D9"/>
+              <w:bottom w:val="single" w:sz="5" w:color="D9D9D9"/>
+              <w:right w:val="single" w:sz="5" w:color="D9D9D9"/>
+            </w:tcBorders>
             <w:tcMar>
               <w:top w:w="80" w:type="dxa"/>
               <w:bottom w:w="80" w:type="dxa"/>
@@ -1192,26 +653,27 @@
           </w:tcPr>
           <w:p>
             <w:pPr>
-              <w:spacing w:after="80" w:before="80" w:line="276" w:lineRule="auto"/>
+              <w:spacing w:before="60" w:after="60"/>
             </w:pPr>
             <w:r>
               <w:rPr>
-                <w:b/>
-                <w:sz w:val="22"/>
+                <w:b w:val="0"/>
+                <w:sz w:val="21"/>
               </w:rPr>
-              <w:t>Expertenstandard</w:t>
+              <w:t>Stamm</w:t>
             </w:r>
           </w:p>
         </w:tc>
-      </w:tr>
-      <w:tr>
-        <w:trPr>
-          <w:trHeight w:hRule="atLeast" w:val="680"/>
-          <w:cantSplit/>
-        </w:trPr>
         <w:tc>
           <w:tcPr>
-            <w:tcW w:type="dxa" w:w="2914"/>
+            <w:tcW w:type="dxa" w:w="1417"/>
+            <w:vAlign w:val="center"/>
+            <w:tcBorders>
+              <w:top w:val="single" w:sz="5" w:color="D9D9D9"/>
+              <w:left w:val="single" w:sz="5" w:color="D9D9D9"/>
+              <w:bottom w:val="single" w:sz="5" w:color="D9D9D9"/>
+              <w:right w:val="single" w:sz="5" w:color="D9D9D9"/>
+            </w:tcBorders>
             <w:tcMar>
               <w:top w:w="80" w:type="dxa"/>
               <w:bottom w:w="80" w:type="dxa"/>
@@ -1221,20 +683,27 @@
           </w:tcPr>
           <w:p>
             <w:pPr>
-              <w:spacing w:after="80" w:before="80" w:line="276" w:lineRule="auto"/>
+              <w:spacing w:before="60" w:after="60"/>
             </w:pPr>
             <w:r>
               <w:rPr>
                 <w:b w:val="0"/>
-                <w:sz w:val="22"/>
+                <w:sz w:val="21"/>
               </w:rPr>
-              <w:t>1 Stamm</w:t>
+              <w:t>____ / 4</w:t>
             </w:r>
           </w:p>
         </w:tc>
         <w:tc>
           <w:tcPr>
-            <w:tcW w:type="dxa" w:w="2241"/>
+            <w:tcW w:type="dxa" w:w="3969"/>
+            <w:vAlign w:val="center"/>
+            <w:tcBorders>
+              <w:top w:val="single" w:sz="5" w:color="D9D9D9"/>
+              <w:left w:val="single" w:sz="5" w:color="D9D9D9"/>
+              <w:bottom w:val="single" w:sz="5" w:color="D9D9D9"/>
+              <w:right w:val="single" w:sz="5" w:color="D9D9D9"/>
+            </w:tcBorders>
             <w:tcMar>
               <w:top w:w="80" w:type="dxa"/>
               <w:bottom w:w="80" w:type="dxa"/>
@@ -1244,19 +713,32 @@
           </w:tcPr>
           <w:p>
             <w:pPr>
-              <w:spacing w:after="80" w:before="80" w:line="276" w:lineRule="auto"/>
+              <w:spacing w:before="60" w:after="60"/>
             </w:pPr>
             <w:r>
               <w:rPr>
                 <w:b w:val="0"/>
-                <w:sz w:val="22"/>
+                <w:sz w:val="21"/>
               </w:rPr>
+              <w:t>A1</w:t>
             </w:r>
           </w:p>
         </w:tc>
+      </w:tr>
+      <w:tr>
+        <w:trPr>
+          <w:cantSplit/>
+        </w:trPr>
         <w:tc>
           <w:tcPr>
-            <w:tcW w:type="dxa" w:w="2241"/>
+            <w:tcW w:type="dxa" w:w="4252"/>
+            <w:vAlign w:val="center"/>
+            <w:tcBorders>
+              <w:top w:val="single" w:sz="5" w:color="D9D9D9"/>
+              <w:left w:val="single" w:sz="5" w:color="D9D9D9"/>
+              <w:bottom w:val="single" w:sz="5" w:color="D9D9D9"/>
+              <w:right w:val="single" w:sz="5" w:color="D9D9D9"/>
+            </w:tcBorders>
             <w:tcMar>
               <w:top w:w="80" w:type="dxa"/>
               <w:bottom w:w="80" w:type="dxa"/>
@@ -1266,19 +748,27 @@
           </w:tcPr>
           <w:p>
             <w:pPr>
-              <w:spacing w:after="80" w:before="80" w:line="276" w:lineRule="auto"/>
+              <w:spacing w:before="60" w:after="60"/>
             </w:pPr>
             <w:r>
               <w:rPr>
                 <w:b w:val="0"/>
-                <w:sz w:val="22"/>
+                <w:sz w:val="21"/>
               </w:rPr>
+              <w:t>Jahresringe</w:t>
             </w:r>
           </w:p>
         </w:tc>
         <w:tc>
           <w:tcPr>
-            <w:tcW w:type="dxa" w:w="2242"/>
+            <w:tcW w:type="dxa" w:w="1417"/>
+            <w:vAlign w:val="center"/>
+            <w:tcBorders>
+              <w:top w:val="single" w:sz="5" w:color="D9D9D9"/>
+              <w:left w:val="single" w:sz="5" w:color="D9D9D9"/>
+              <w:bottom w:val="single" w:sz="5" w:color="D9D9D9"/>
+              <w:right w:val="single" w:sz="5" w:color="D9D9D9"/>
+            </w:tcBorders>
             <w:tcMar>
               <w:top w:w="80" w:type="dxa"/>
               <w:bottom w:w="80" w:type="dxa"/>
@@ -1288,25 +778,27 @@
           </w:tcPr>
           <w:p>
             <w:pPr>
-              <w:spacing w:after="80" w:before="80" w:line="276" w:lineRule="auto"/>
+              <w:spacing w:before="60" w:after="60"/>
             </w:pPr>
             <w:r>
               <w:rPr>
                 <w:b w:val="0"/>
-                <w:sz w:val="22"/>
+                <w:sz w:val="21"/>
               </w:rPr>
+              <w:t>____ / 4</w:t>
             </w:r>
           </w:p>
         </w:tc>
-      </w:tr>
-      <w:tr>
-        <w:trPr>
-          <w:trHeight w:hRule="atLeast" w:val="680"/>
-          <w:cantSplit/>
-        </w:trPr>
         <w:tc>
           <w:tcPr>
-            <w:tcW w:type="dxa" w:w="2914"/>
+            <w:tcW w:type="dxa" w:w="3969"/>
+            <w:vAlign w:val="center"/>
+            <w:tcBorders>
+              <w:top w:val="single" w:sz="5" w:color="D9D9D9"/>
+              <w:left w:val="single" w:sz="5" w:color="D9D9D9"/>
+              <w:bottom w:val="single" w:sz="5" w:color="D9D9D9"/>
+              <w:right w:val="single" w:sz="5" w:color="D9D9D9"/>
+            </w:tcBorders>
             <w:tcMar>
               <w:top w:w="80" w:type="dxa"/>
               <w:bottom w:w="80" w:type="dxa"/>
@@ -1316,20 +808,32 @@
           </w:tcPr>
           <w:p>
             <w:pPr>
-              <w:spacing w:after="80" w:before="80" w:line="276" w:lineRule="auto"/>
+              <w:spacing w:before="60" w:after="60"/>
             </w:pPr>
             <w:r>
               <w:rPr>
                 <w:b w:val="0"/>
-                <w:sz w:val="22"/>
+                <w:sz w:val="21"/>
               </w:rPr>
-              <w:t>2 Jahresringe</w:t>
+              <w:t>A2</w:t>
             </w:r>
           </w:p>
         </w:tc>
+      </w:tr>
+      <w:tr>
+        <w:trPr>
+          <w:cantSplit/>
+        </w:trPr>
         <w:tc>
           <w:tcPr>
-            <w:tcW w:type="dxa" w:w="2241"/>
+            <w:tcW w:type="dxa" w:w="4252"/>
+            <w:vAlign w:val="center"/>
+            <w:tcBorders>
+              <w:top w:val="single" w:sz="5" w:color="D9D9D9"/>
+              <w:left w:val="single" w:sz="5" w:color="D9D9D9"/>
+              <w:bottom w:val="single" w:sz="5" w:color="D9D9D9"/>
+              <w:right w:val="single" w:sz="5" w:color="D9D9D9"/>
+            </w:tcBorders>
             <w:tcMar>
               <w:top w:w="80" w:type="dxa"/>
               <w:bottom w:w="80" w:type="dxa"/>
@@ -1339,19 +843,27 @@
           </w:tcPr>
           <w:p>
             <w:pPr>
-              <w:spacing w:after="80" w:before="80" w:line="276" w:lineRule="auto"/>
+              <w:spacing w:before="60" w:after="60"/>
             </w:pPr>
             <w:r>
               <w:rPr>
                 <w:b w:val="0"/>
-                <w:sz w:val="22"/>
+                <w:sz w:val="21"/>
               </w:rPr>
+              <w:t>Produktionsweg und Schnittplan</w:t>
             </w:r>
           </w:p>
         </w:tc>
         <w:tc>
           <w:tcPr>
-            <w:tcW w:type="dxa" w:w="2241"/>
+            <w:tcW w:type="dxa" w:w="1417"/>
+            <w:vAlign w:val="center"/>
+            <w:tcBorders>
+              <w:top w:val="single" w:sz="5" w:color="D9D9D9"/>
+              <w:left w:val="single" w:sz="5" w:color="D9D9D9"/>
+              <w:bottom w:val="single" w:sz="5" w:color="D9D9D9"/>
+              <w:right w:val="single" w:sz="5" w:color="D9D9D9"/>
+            </w:tcBorders>
             <w:tcMar>
               <w:top w:w="80" w:type="dxa"/>
               <w:bottom w:w="80" w:type="dxa"/>
@@ -1361,19 +873,27 @@
           </w:tcPr>
           <w:p>
             <w:pPr>
-              <w:spacing w:after="80" w:before="80" w:line="276" w:lineRule="auto"/>
+              <w:spacing w:before="60" w:after="60"/>
             </w:pPr>
             <w:r>
               <w:rPr>
                 <w:b w:val="0"/>
-                <w:sz w:val="22"/>
+                <w:sz w:val="21"/>
               </w:rPr>
+              <w:t>____ / 6</w:t>
             </w:r>
           </w:p>
         </w:tc>
         <w:tc>
           <w:tcPr>
-            <w:tcW w:type="dxa" w:w="2242"/>
+            <w:tcW w:type="dxa" w:w="3969"/>
+            <w:vAlign w:val="center"/>
+            <w:tcBorders>
+              <w:top w:val="single" w:sz="5" w:color="D9D9D9"/>
+              <w:left w:val="single" w:sz="5" w:color="D9D9D9"/>
+              <w:bottom w:val="single" w:sz="5" w:color="D9D9D9"/>
+              <w:right w:val="single" w:sz="5" w:color="D9D9D9"/>
+            </w:tcBorders>
             <w:tcMar>
               <w:top w:w="80" w:type="dxa"/>
               <w:bottom w:w="80" w:type="dxa"/>
@@ -1383,25 +903,32 @@
           </w:tcPr>
           <w:p>
             <w:pPr>
-              <w:spacing w:after="80" w:before="80" w:line="276" w:lineRule="auto"/>
+              <w:spacing w:before="60" w:after="60"/>
             </w:pPr>
             <w:r>
               <w:rPr>
                 <w:b w:val="0"/>
-                <w:sz w:val="22"/>
+                <w:sz w:val="21"/>
               </w:rPr>
+              <w:t>A3 und A4</w:t>
             </w:r>
           </w:p>
         </w:tc>
       </w:tr>
       <w:tr>
         <w:trPr>
-          <w:trHeight w:hRule="atLeast" w:val="680"/>
           <w:cantSplit/>
         </w:trPr>
         <w:tc>
           <w:tcPr>
-            <w:tcW w:type="dxa" w:w="2914"/>
+            <w:tcW w:type="dxa" w:w="4252"/>
+            <w:vAlign w:val="center"/>
+            <w:tcBorders>
+              <w:top w:val="single" w:sz="5" w:color="D9D9D9"/>
+              <w:left w:val="single" w:sz="5" w:color="D9D9D9"/>
+              <w:bottom w:val="single" w:sz="5" w:color="D9D9D9"/>
+              <w:right w:val="single" w:sz="5" w:color="D9D9D9"/>
+            </w:tcBorders>
             <w:tcMar>
               <w:top w:w="80" w:type="dxa"/>
               <w:bottom w:w="80" w:type="dxa"/>
@@ -1411,20 +938,27 @@
           </w:tcPr>
           <w:p>
             <w:pPr>
-              <w:spacing w:after="80" w:before="80" w:line="276" w:lineRule="auto"/>
+              <w:spacing w:before="60" w:after="60"/>
             </w:pPr>
             <w:r>
               <w:rPr>
                 <w:b w:val="0"/>
-                <w:sz w:val="22"/>
+                <w:sz w:val="21"/>
               </w:rPr>
-              <w:t>3 Produktionsweg</w:t>
+              <w:t>Holzproben</w:t>
             </w:r>
           </w:p>
         </w:tc>
         <w:tc>
           <w:tcPr>
-            <w:tcW w:type="dxa" w:w="2241"/>
+            <w:tcW w:type="dxa" w:w="1417"/>
+            <w:vAlign w:val="center"/>
+            <w:tcBorders>
+              <w:top w:val="single" w:sz="5" w:color="D9D9D9"/>
+              <w:left w:val="single" w:sz="5" w:color="D9D9D9"/>
+              <w:bottom w:val="single" w:sz="5" w:color="D9D9D9"/>
+              <w:right w:val="single" w:sz="5" w:color="D9D9D9"/>
+            </w:tcBorders>
             <w:tcMar>
               <w:top w:w="80" w:type="dxa"/>
               <w:bottom w:w="80" w:type="dxa"/>
@@ -1434,19 +968,27 @@
           </w:tcPr>
           <w:p>
             <w:pPr>
-              <w:spacing w:after="80" w:before="80" w:line="276" w:lineRule="auto"/>
+              <w:spacing w:before="60" w:after="60"/>
             </w:pPr>
             <w:r>
               <w:rPr>
                 <w:b w:val="0"/>
-                <w:sz w:val="22"/>
+                <w:sz w:val="21"/>
               </w:rPr>
+              <w:t>____ / 4</w:t>
             </w:r>
           </w:p>
         </w:tc>
         <w:tc>
           <w:tcPr>
-            <w:tcW w:type="dxa" w:w="2241"/>
+            <w:tcW w:type="dxa" w:w="3969"/>
+            <w:vAlign w:val="center"/>
+            <w:tcBorders>
+              <w:top w:val="single" w:sz="5" w:color="D9D9D9"/>
+              <w:left w:val="single" w:sz="5" w:color="D9D9D9"/>
+              <w:bottom w:val="single" w:sz="5" w:color="D9D9D9"/>
+              <w:right w:val="single" w:sz="5" w:color="D9D9D9"/>
+            </w:tcBorders>
             <w:tcMar>
               <w:top w:w="80" w:type="dxa"/>
               <w:bottom w:w="80" w:type="dxa"/>
@@ -1456,19 +998,32 @@
           </w:tcPr>
           <w:p>
             <w:pPr>
-              <w:spacing w:after="80" w:before="80" w:line="276" w:lineRule="auto"/>
+              <w:spacing w:before="60" w:after="60"/>
             </w:pPr>
             <w:r>
               <w:rPr>
                 <w:b w:val="0"/>
-                <w:sz w:val="22"/>
+                <w:sz w:val="21"/>
               </w:rPr>
+              <w:t>A5 und A6</w:t>
             </w:r>
           </w:p>
         </w:tc>
+      </w:tr>
+      <w:tr>
+        <w:trPr>
+          <w:cantSplit/>
+        </w:trPr>
         <w:tc>
           <w:tcPr>
-            <w:tcW w:type="dxa" w:w="2242"/>
+            <w:tcW w:type="dxa" w:w="4252"/>
+            <w:vAlign w:val="center"/>
+            <w:tcBorders>
+              <w:top w:val="single" w:sz="5" w:color="D9D9D9"/>
+              <w:left w:val="single" w:sz="5" w:color="D9D9D9"/>
+              <w:bottom w:val="single" w:sz="5" w:color="D9D9D9"/>
+              <w:right w:val="single" w:sz="5" w:color="D9D9D9"/>
+            </w:tcBorders>
             <w:tcMar>
               <w:top w:w="80" w:type="dxa"/>
               <w:bottom w:w="80" w:type="dxa"/>
@@ -1478,25 +1033,27 @@
           </w:tcPr>
           <w:p>
             <w:pPr>
-              <w:spacing w:after="80" w:before="80" w:line="276" w:lineRule="auto"/>
+              <w:spacing w:before="60" w:after="60"/>
             </w:pPr>
             <w:r>
               <w:rPr>
                 <w:b w:val="0"/>
-                <w:sz w:val="22"/>
+                <w:sz w:val="21"/>
               </w:rPr>
+              <w:t>Holzfeuchte</w:t>
             </w:r>
           </w:p>
         </w:tc>
-      </w:tr>
-      <w:tr>
-        <w:trPr>
-          <w:trHeight w:hRule="atLeast" w:val="680"/>
-          <w:cantSplit/>
-        </w:trPr>
         <w:tc>
           <w:tcPr>
-            <w:tcW w:type="dxa" w:w="2914"/>
+            <w:tcW w:type="dxa" w:w="1417"/>
+            <w:vAlign w:val="center"/>
+            <w:tcBorders>
+              <w:top w:val="single" w:sz="5" w:color="D9D9D9"/>
+              <w:left w:val="single" w:sz="5" w:color="D9D9D9"/>
+              <w:bottom w:val="single" w:sz="5" w:color="D9D9D9"/>
+              <w:right w:val="single" w:sz="5" w:color="D9D9D9"/>
+            </w:tcBorders>
             <w:tcMar>
               <w:top w:w="80" w:type="dxa"/>
               <w:bottom w:w="80" w:type="dxa"/>
@@ -1506,20 +1063,27 @@
           </w:tcPr>
           <w:p>
             <w:pPr>
-              <w:spacing w:after="80" w:before="80" w:line="276" w:lineRule="auto"/>
+              <w:spacing w:before="60" w:after="60"/>
             </w:pPr>
             <w:r>
               <w:rPr>
                 <w:b w:val="0"/>
-                <w:sz w:val="22"/>
+                <w:sz w:val="21"/>
               </w:rPr>
-              <w:t>4 Prüfen</w:t>
+              <w:t>____ / 4</w:t>
             </w:r>
           </w:p>
         </w:tc>
         <w:tc>
           <w:tcPr>
-            <w:tcW w:type="dxa" w:w="2241"/>
+            <w:tcW w:type="dxa" w:w="3969"/>
+            <w:vAlign w:val="center"/>
+            <w:tcBorders>
+              <w:top w:val="single" w:sz="5" w:color="D9D9D9"/>
+              <w:left w:val="single" w:sz="5" w:color="D9D9D9"/>
+              <w:bottom w:val="single" w:sz="5" w:color="D9D9D9"/>
+              <w:right w:val="single" w:sz="5" w:color="D9D9D9"/>
+            </w:tcBorders>
             <w:tcMar>
               <w:top w:w="80" w:type="dxa"/>
               <w:bottom w:w="80" w:type="dxa"/>
@@ -1529,19 +1093,32 @@
           </w:tcPr>
           <w:p>
             <w:pPr>
-              <w:spacing w:after="80" w:before="80" w:line="276" w:lineRule="auto"/>
+              <w:spacing w:before="60" w:after="60"/>
             </w:pPr>
             <w:r>
               <w:rPr>
                 <w:b w:val="0"/>
-                <w:sz w:val="22"/>
+                <w:sz w:val="21"/>
               </w:rPr>
+              <w:t>A7</w:t>
             </w:r>
           </w:p>
         </w:tc>
+      </w:tr>
+      <w:tr>
+        <w:trPr>
+          <w:cantSplit/>
+        </w:trPr>
         <w:tc>
           <w:tcPr>
-            <w:tcW w:type="dxa" w:w="2241"/>
+            <w:tcW w:type="dxa" w:w="4252"/>
+            <w:vAlign w:val="center"/>
+            <w:tcBorders>
+              <w:top w:val="single" w:sz="5" w:color="D9D9D9"/>
+              <w:left w:val="single" w:sz="5" w:color="D9D9D9"/>
+              <w:bottom w:val="single" w:sz="5" w:color="D9D9D9"/>
+              <w:right w:val="single" w:sz="5" w:color="D9D9D9"/>
+            </w:tcBorders>
             <w:tcMar>
               <w:top w:w="80" w:type="dxa"/>
               <w:bottom w:w="80" w:type="dxa"/>
@@ -1551,19 +1128,27 @@
           </w:tcPr>
           <w:p>
             <w:pPr>
-              <w:spacing w:after="80" w:before="80" w:line="276" w:lineRule="auto"/>
+              <w:spacing w:before="60" w:after="60"/>
             </w:pPr>
             <w:r>
               <w:rPr>
                 <w:b w:val="0"/>
-                <w:sz w:val="22"/>
+                <w:sz w:val="21"/>
               </w:rPr>
+              <w:t>Holzfehler</w:t>
             </w:r>
           </w:p>
         </w:tc>
         <w:tc>
           <w:tcPr>
-            <w:tcW w:type="dxa" w:w="2242"/>
+            <w:tcW w:type="dxa" w:w="1417"/>
+            <w:vAlign w:val="center"/>
+            <w:tcBorders>
+              <w:top w:val="single" w:sz="5" w:color="D9D9D9"/>
+              <w:left w:val="single" w:sz="5" w:color="D9D9D9"/>
+              <w:bottom w:val="single" w:sz="5" w:color="D9D9D9"/>
+              <w:right w:val="single" w:sz="5" w:color="D9D9D9"/>
+            </w:tcBorders>
             <w:tcMar>
               <w:top w:w="80" w:type="dxa"/>
               <w:bottom w:w="80" w:type="dxa"/>
@@ -1573,25 +1158,27 @@
           </w:tcPr>
           <w:p>
             <w:pPr>
-              <w:spacing w:after="80" w:before="80" w:line="276" w:lineRule="auto"/>
+              <w:spacing w:before="60" w:after="60"/>
             </w:pPr>
             <w:r>
               <w:rPr>
                 <w:b w:val="0"/>
-                <w:sz w:val="22"/>
+                <w:sz w:val="21"/>
               </w:rPr>
+              <w:t>____ / 4</w:t>
             </w:r>
           </w:p>
         </w:tc>
-      </w:tr>
-      <w:tr>
-        <w:trPr>
-          <w:trHeight w:hRule="atLeast" w:val="680"/>
-          <w:cantSplit/>
-        </w:trPr>
         <w:tc>
           <w:tcPr>
-            <w:tcW w:type="dxa" w:w="2914"/>
+            <w:tcW w:type="dxa" w:w="3969"/>
+            <w:vAlign w:val="center"/>
+            <w:tcBorders>
+              <w:top w:val="single" w:sz="5" w:color="D9D9D9"/>
+              <w:left w:val="single" w:sz="5" w:color="D9D9D9"/>
+              <w:bottom w:val="single" w:sz="5" w:color="D9D9D9"/>
+              <w:right w:val="single" w:sz="5" w:color="D9D9D9"/>
+            </w:tcBorders>
             <w:tcMar>
               <w:top w:w="80" w:type="dxa"/>
               <w:bottom w:w="80" w:type="dxa"/>
@@ -1601,20 +1188,32 @@
           </w:tcPr>
           <w:p>
             <w:pPr>
-              <w:spacing w:after="80" w:before="80" w:line="276" w:lineRule="auto"/>
+              <w:spacing w:before="60" w:after="60"/>
             </w:pPr>
             <w:r>
               <w:rPr>
                 <w:b w:val="0"/>
-                <w:sz w:val="22"/>
+                <w:sz w:val="21"/>
               </w:rPr>
-              <w:t>5 Holz arbeitet</w:t>
+              <w:t>A8</w:t>
             </w:r>
           </w:p>
         </w:tc>
+      </w:tr>
+      <w:tr>
+        <w:trPr>
+          <w:cantSplit/>
+        </w:trPr>
         <w:tc>
           <w:tcPr>
-            <w:tcW w:type="dxa" w:w="2241"/>
+            <w:tcW w:type="dxa" w:w="4252"/>
+            <w:vAlign w:val="center"/>
+            <w:tcBorders>
+              <w:top w:val="single" w:sz="5" w:color="D9D9D9"/>
+              <w:left w:val="single" w:sz="5" w:color="D9D9D9"/>
+              <w:bottom w:val="single" w:sz="5" w:color="D9D9D9"/>
+              <w:right w:val="single" w:sz="5" w:color="D9D9D9"/>
+            </w:tcBorders>
             <w:tcMar>
               <w:top w:w="80" w:type="dxa"/>
               <w:bottom w:w="80" w:type="dxa"/>
@@ -1624,19 +1223,27 @@
           </w:tcPr>
           <w:p>
             <w:pPr>
-              <w:spacing w:after="80" w:before="80" w:line="276" w:lineRule="auto"/>
+              <w:spacing w:before="60" w:after="60"/>
             </w:pPr>
             <w:r>
               <w:rPr>
                 <w:b w:val="0"/>
-                <w:sz w:val="22"/>
+                <w:sz w:val="21"/>
               </w:rPr>
+              <w:t>Materialentscheidung</w:t>
             </w:r>
           </w:p>
         </w:tc>
         <w:tc>
           <w:tcPr>
-            <w:tcW w:type="dxa" w:w="2241"/>
+            <w:tcW w:type="dxa" w:w="1417"/>
+            <w:vAlign w:val="center"/>
+            <w:tcBorders>
+              <w:top w:val="single" w:sz="5" w:color="D9D9D9"/>
+              <w:left w:val="single" w:sz="5" w:color="D9D9D9"/>
+              <w:bottom w:val="single" w:sz="5" w:color="D9D9D9"/>
+              <w:right w:val="single" w:sz="5" w:color="D9D9D9"/>
+            </w:tcBorders>
             <w:tcMar>
               <w:top w:w="80" w:type="dxa"/>
               <w:bottom w:w="80" w:type="dxa"/>
@@ -1646,19 +1253,27 @@
           </w:tcPr>
           <w:p>
             <w:pPr>
-              <w:spacing w:after="80" w:before="80" w:line="276" w:lineRule="auto"/>
+              <w:spacing w:before="60" w:after="60"/>
             </w:pPr>
             <w:r>
               <w:rPr>
                 <w:b w:val="0"/>
-                <w:sz w:val="22"/>
+                <w:sz w:val="21"/>
               </w:rPr>
+              <w:t>____ / 4</w:t>
             </w:r>
           </w:p>
         </w:tc>
         <w:tc>
           <w:tcPr>
-            <w:tcW w:type="dxa" w:w="2242"/>
+            <w:tcW w:type="dxa" w:w="3969"/>
+            <w:vAlign w:val="center"/>
+            <w:tcBorders>
+              <w:top w:val="single" w:sz="5" w:color="D9D9D9"/>
+              <w:left w:val="single" w:sz="5" w:color="D9D9D9"/>
+              <w:bottom w:val="single" w:sz="5" w:color="D9D9D9"/>
+              <w:right w:val="single" w:sz="5" w:color="D9D9D9"/>
+            </w:tcBorders>
             <w:tcMar>
               <w:top w:w="80" w:type="dxa"/>
               <w:bottom w:w="80" w:type="dxa"/>
@@ -1668,203 +1283,14 @@
           </w:tcPr>
           <w:p>
             <w:pPr>
-              <w:spacing w:after="80" w:before="80" w:line="276" w:lineRule="auto"/>
+              <w:spacing w:before="60" w:after="60"/>
             </w:pPr>
             <w:r>
               <w:rPr>
                 <w:b w:val="0"/>
-                <w:sz w:val="22"/>
+                <w:sz w:val="21"/>
               </w:rPr>
-            </w:r>
-          </w:p>
-        </w:tc>
-      </w:tr>
-      <w:tr>
-        <w:trPr>
-          <w:trHeight w:hRule="atLeast" w:val="680"/>
-          <w:cantSplit/>
-        </w:trPr>
-        <w:tc>
-          <w:tcPr>
-            <w:tcW w:type="dxa" w:w="2914"/>
-            <w:tcMar>
-              <w:top w:w="80" w:type="dxa"/>
-              <w:bottom w:w="80" w:type="dxa"/>
-              <w:start w:w="120" w:type="dxa"/>
-              <w:end w:w="120" w:type="dxa"/>
-            </w:tcMar>
-          </w:tcPr>
-          <w:p>
-            <w:pPr>
-              <w:spacing w:after="80" w:before="80" w:line="276" w:lineRule="auto"/>
-            </w:pPr>
-            <w:r>
-              <w:rPr>
-                <w:b w:val="0"/>
-                <w:sz w:val="22"/>
-              </w:rPr>
-              <w:t>6 Holzfehler</w:t>
-            </w:r>
-          </w:p>
-        </w:tc>
-        <w:tc>
-          <w:tcPr>
-            <w:tcW w:type="dxa" w:w="2241"/>
-            <w:tcMar>
-              <w:top w:w="80" w:type="dxa"/>
-              <w:bottom w:w="80" w:type="dxa"/>
-              <w:start w:w="120" w:type="dxa"/>
-              <w:end w:w="120" w:type="dxa"/>
-            </w:tcMar>
-          </w:tcPr>
-          <w:p>
-            <w:pPr>
-              <w:spacing w:after="80" w:before="80" w:line="276" w:lineRule="auto"/>
-            </w:pPr>
-            <w:r>
-              <w:rPr>
-                <w:b w:val="0"/>
-                <w:sz w:val="22"/>
-              </w:rPr>
-            </w:r>
-          </w:p>
-        </w:tc>
-        <w:tc>
-          <w:tcPr>
-            <w:tcW w:type="dxa" w:w="2241"/>
-            <w:tcMar>
-              <w:top w:w="80" w:type="dxa"/>
-              <w:bottom w:w="80" w:type="dxa"/>
-              <w:start w:w="120" w:type="dxa"/>
-              <w:end w:w="120" w:type="dxa"/>
-            </w:tcMar>
-          </w:tcPr>
-          <w:p>
-            <w:pPr>
-              <w:spacing w:after="80" w:before="80" w:line="276" w:lineRule="auto"/>
-            </w:pPr>
-            <w:r>
-              <w:rPr>
-                <w:b w:val="0"/>
-                <w:sz w:val="22"/>
-              </w:rPr>
-            </w:r>
-          </w:p>
-        </w:tc>
-        <w:tc>
-          <w:tcPr>
-            <w:tcW w:type="dxa" w:w="2242"/>
-            <w:tcMar>
-              <w:top w:w="80" w:type="dxa"/>
-              <w:bottom w:w="80" w:type="dxa"/>
-              <w:start w:w="120" w:type="dxa"/>
-              <w:end w:w="120" w:type="dxa"/>
-            </w:tcMar>
-          </w:tcPr>
-          <w:p>
-            <w:pPr>
-              <w:spacing w:after="80" w:before="80" w:line="276" w:lineRule="auto"/>
-            </w:pPr>
-            <w:r>
-              <w:rPr>
-                <w:b w:val="0"/>
-                <w:sz w:val="22"/>
-              </w:rPr>
-            </w:r>
-          </w:p>
-        </w:tc>
-      </w:tr>
-      <w:tr>
-        <w:trPr>
-          <w:trHeight w:hRule="atLeast" w:val="680"/>
-          <w:cantSplit/>
-        </w:trPr>
-        <w:tc>
-          <w:tcPr>
-            <w:tcW w:type="dxa" w:w="2914"/>
-            <w:tcMar>
-              <w:top w:w="80" w:type="dxa"/>
-              <w:bottom w:w="80" w:type="dxa"/>
-              <w:start w:w="120" w:type="dxa"/>
-              <w:end w:w="120" w:type="dxa"/>
-            </w:tcMar>
-          </w:tcPr>
-          <w:p>
-            <w:pPr>
-              <w:spacing w:after="80" w:before="80" w:line="276" w:lineRule="auto"/>
-            </w:pPr>
-            <w:r>
-              <w:rPr>
-                <w:b w:val="0"/>
-                <w:sz w:val="22"/>
-              </w:rPr>
-              <w:t>7 Beratung</w:t>
-            </w:r>
-          </w:p>
-        </w:tc>
-        <w:tc>
-          <w:tcPr>
-            <w:tcW w:type="dxa" w:w="2241"/>
-            <w:tcMar>
-              <w:top w:w="80" w:type="dxa"/>
-              <w:bottom w:w="80" w:type="dxa"/>
-              <w:start w:w="120" w:type="dxa"/>
-              <w:end w:w="120" w:type="dxa"/>
-            </w:tcMar>
-          </w:tcPr>
-          <w:p>
-            <w:pPr>
-              <w:spacing w:after="80" w:before="80" w:line="276" w:lineRule="auto"/>
-            </w:pPr>
-            <w:r>
-              <w:rPr>
-                <w:b w:val="0"/>
-                <w:sz w:val="22"/>
-              </w:rPr>
-            </w:r>
-          </w:p>
-        </w:tc>
-        <w:tc>
-          <w:tcPr>
-            <w:tcW w:type="dxa" w:w="2241"/>
-            <w:tcMar>
-              <w:top w:w="80" w:type="dxa"/>
-              <w:bottom w:w="80" w:type="dxa"/>
-              <w:start w:w="120" w:type="dxa"/>
-              <w:end w:w="120" w:type="dxa"/>
-            </w:tcMar>
-          </w:tcPr>
-          <w:p>
-            <w:pPr>
-              <w:spacing w:after="80" w:before="80" w:line="276" w:lineRule="auto"/>
-            </w:pPr>
-            <w:r>
-              <w:rPr>
-                <w:b w:val="0"/>
-                <w:sz w:val="22"/>
-              </w:rPr>
-            </w:r>
-          </w:p>
-        </w:tc>
-        <w:tc>
-          <w:tcPr>
-            <w:tcW w:type="dxa" w:w="2242"/>
-            <w:tcMar>
-              <w:top w:w="80" w:type="dxa"/>
-              <w:bottom w:w="80" w:type="dxa"/>
-              <w:start w:w="120" w:type="dxa"/>
-              <w:end w:w="120" w:type="dxa"/>
-            </w:tcMar>
-          </w:tcPr>
-          <w:p>
-            <w:pPr>
-              <w:spacing w:after="80" w:before="80" w:line="276" w:lineRule="auto"/>
-            </w:pPr>
-            <w:r>
-              <w:rPr>
-                <w:b w:val="0"/>
-                <w:sz w:val="22"/>
-              </w:rPr>
+              <w:t>A9 und A10</w:t>
             </w:r>
           </w:p>
         </w:tc>
@@ -1875,105 +1301,58 @@
         <w:pStyle w:val="Heading2"/>
       </w:pPr>
       <w:r>
-        <w:t>Das kannst du schon sicher</w:t>
+        <w:t>Das gelingt dir schon</w:t>
       </w:r>
     </w:p>
     <w:p>
-      <w:pPr>
-        <w:spacing w:after="0" w:line="480" w:lineRule="exact" w:before="0"/>
-        <w:pBdr>
-          <w:bottom w:val="single" w:sz="3" w:color="AAAAAA"/>
-          <w:between w:val="single" w:sz="3" w:color="AAAAAA"/>
-        </w:pBdr>
-      </w:pPr>
-    </w:p>
-    <w:p>
-      <w:pPr>
-        <w:spacing w:after="0" w:line="480" w:lineRule="exact" w:before="0"/>
-        <w:pBdr>
-          <w:bottom w:val="single" w:sz="3" w:color="AAAAAA"/>
-          <w:between w:val="single" w:sz="3" w:color="AAAAAA"/>
-        </w:pBdr>
-      </w:pPr>
-    </w:p>
-    <w:p>
-      <w:pPr>
-        <w:spacing w:after="0" w:line="480" w:lineRule="exact" w:before="0"/>
-        <w:pBdr>
-          <w:bottom w:val="single" w:sz="3" w:color="AAAAAA"/>
-          <w:between w:val="single" w:sz="3" w:color="AAAAAA"/>
-        </w:pBdr>
-      </w:pPr>
+      <w:r>
+        <w:rPr>
+          <w:b w:val="0"/>
+        </w:rPr>
+        <w:t>________________________________________________________________</w:t>
+        <w:br/>
+        <w:t>________________________________________________________________</w:t>
+      </w:r>
     </w:p>
     <w:p>
       <w:pPr>
         <w:pStyle w:val="Heading2"/>
       </w:pPr>
       <w:r>
-        <w:t>Dein nächster Lernschritt</w:t>
+        <w:t>Deine nächsten Schritte</w:t>
       </w:r>
     </w:p>
     <w:p>
       <w:r>
-        <w:t>Übe zuerst: _________________________  Auftrag: __________</w:t>
+        <w:rPr>
+          <w:b w:val="0"/>
+        </w:rPr>
+        <w:t>Übe zuerst: _____________________________________________________</w:t>
+        <w:br/>
+        <w:t>Passender Auftrag: ______________________________________________</w:t>
       </w:r>
     </w:p>
     <w:p>
       <w:r>
-        <w:t>Nutze U.1 für dein Ergebnis. Prüfe es danach mit einem Partner oder deiner Lehrkraft.</w:t>
-      </w:r>
-    </w:p>
-    <w:p>
-      <w:pPr>
-        <w:spacing w:after="0" w:line="480" w:lineRule="exact" w:before="0"/>
-        <w:pBdr>
-          <w:bottom w:val="single" w:sz="3" w:color="AAAAAA"/>
-          <w:between w:val="single" w:sz="3" w:color="AAAAAA"/>
-        </w:pBdr>
-      </w:pPr>
-    </w:p>
-    <w:p>
-      <w:pPr>
-        <w:spacing w:after="0" w:line="480" w:lineRule="exact" w:before="0"/>
-        <w:pBdr>
-          <w:bottom w:val="single" w:sz="3" w:color="AAAAAA"/>
-          <w:between w:val="single" w:sz="3" w:color="AAAAAA"/>
-        </w:pBdr>
-      </w:pPr>
-    </w:p>
-    <w:p>
-      <w:r>
-        <w:t>Passendes Material: 1 → A1 | 2 → A2 | 3 → A3/A4 | 4 → A5/A6 | 5 → A7 | 6 → A8 | 7 → A9/A10</w:t>
+        <w:rPr>
+          <w:b w:val="0"/>
+        </w:rPr>
+        <w:t>Wenn nötig, übe danach: __________________________________________</w:t>
       </w:r>
     </w:p>
     <w:p>
       <w:r>
-        <w:t>Rückblick: Das kann ich nach der Übung besser:</w:t>
+        <w:rPr>
+          <w:b w:val="0"/>
+        </w:rPr>
+        <w:t>Erkläre einen dieser Zusammenhänge in zwei eigenen Sätzen auf U.1. Besprich deine Erklärung mit einem Partner oder deiner Lehrkraft.</w:t>
       </w:r>
-    </w:p>
-    <w:p>
-      <w:pPr>
-        <w:spacing w:after="0" w:line="480" w:lineRule="exact" w:before="0"/>
-        <w:pBdr>
-          <w:bottom w:val="single" w:sz="3" w:color="AAAAAA"/>
-          <w:between w:val="single" w:sz="3" w:color="AAAAAA"/>
-        </w:pBdr>
-      </w:pPr>
-    </w:p>
-    <w:p>
-      <w:pPr>
-        <w:spacing w:after="0" w:line="480" w:lineRule="exact" w:before="0"/>
-        <w:pBdr>
-          <w:bottom w:val="single" w:sz="3" w:color="AAAAAA"/>
-          <w:between w:val="single" w:sz="3" w:color="AAAAAA"/>
-        </w:pBdr>
-      </w:pPr>
     </w:p>
     <w:sectPr>
       <w:headerReference w:type="default" r:id="rId9"/>
       <w:footerReference w:type="default" r:id="rId10"/>
       <w:pgSz w:w="11906" w:h="16838"/>
-      <w:pgMar w:top="1020" w:right="1134" w:bottom="1020" w:left="1134" w:header="720" w:footer="720" w:gutter="0"/>
+      <w:pgMar w:top="964" w:right="1020" w:bottom="964" w:left="1247" w:header="720" w:footer="720" w:gutter="0"/>
       <w:cols w:space="720"/>
       <w:docGrid w:linePitch="360"/>
     </w:sectPr>
@@ -1988,7 +1367,7 @@
       <w:pStyle w:val="Footer"/>
     </w:pPr>
     <w:r>
-      <w:t xml:space="preserve">Erwartungshorizont Holz                                              </w:t>
+      <w:t xml:space="preserve">Erwartungshorizont  |  30 Minuten Open Book  |  Seite </w:t>
     </w:r>
     <w:fldSimple w:instr="PAGE"/>
   </w:p>
@@ -2002,7 +1381,7 @@
       <w:pStyle w:val="Header"/>
     </w:pPr>
     <w:r>
-      <w:t>HBG  |  WP Technik 7  |  Lehrkraftmaterial</w:t>
+      <w:t>WP Technik 7  |  Vom Baum zum Holz</w:t>
     </w:r>
   </w:p>
 </w:hdr>
@@ -2372,10 +1751,10 @@
     <w:qFormat/>
     <w:rsid w:val="00FC693F"/>
     <w:pPr>
-      <w:spacing w:after="120" w:line="276" w:lineRule="auto"/>
+      <w:spacing w:line="264" w:lineRule="auto" w:after="100" w:before="0"/>
     </w:pPr>
     <w:rPr>
-      <w:rFonts w:ascii="Arial" w:hAnsi="Arial"/>
+      <w:rFonts w:ascii="DejaVu Sans" w:hAnsi="DejaVu Sans"/>
       <w:color w:val="000000"/>
       <w:sz w:val="22"/>
     </w:rPr>
@@ -2394,6 +1773,9 @@
       </w:tabs>
       <w:spacing w:after="0" w:line="240" w:lineRule="auto"/>
     </w:pPr>
+    <w:rPr>
+      <w:sz w:val="16"/>
+    </w:rPr>
   </w:style>
   <w:style w:type="character" w:customStyle="1" w:styleId="HeaderChar">
     <w:name w:val="Header Char"/>
@@ -2416,6 +1798,9 @@
       </w:tabs>
       <w:spacing w:after="0" w:line="240" w:lineRule="auto"/>
     </w:pPr>
+    <w:rPr>
+      <w:sz w:val="16"/>
+    </w:rPr>
   </w:style>
   <w:style w:type="character" w:customStyle="1" w:styleId="FooterChar">
     <w:name w:val="Footer Char"/>
@@ -2435,15 +1820,15 @@
     <w:pPr>
       <w:keepNext/>
       <w:keepLines/>
-      <w:spacing w:before="480" w:after="120" w:line="276" w:lineRule="auto"/>
+      <w:spacing w:before="160" w:after="100" w:line="264" w:lineRule="auto"/>
       <w:outlineLvl w:val="0"/>
     </w:pPr>
     <w:rPr>
-      <w:rFonts w:asciiTheme="majorHAnsi" w:eastAsiaTheme="majorEastAsia" w:hAnsiTheme="majorHAnsi" w:cstheme="majorBidi" w:ascii="Arial" w:hAnsi="Arial"/>
+      <w:rFonts w:asciiTheme="majorHAnsi" w:eastAsiaTheme="majorEastAsia" w:hAnsiTheme="majorHAnsi" w:cstheme="majorBidi" w:ascii="DejaVu Sans" w:hAnsi="DejaVu Sans"/>
       <w:b/>
       <w:bCs/>
       <w:color w:val="000000"/>
-      <w:sz w:val="36"/>
+      <w:sz w:val="34"/>
       <w:szCs w:val="28"/>
     </w:rPr>
   </w:style>
@@ -2459,15 +1844,15 @@
     <w:pPr>
       <w:keepNext/>
       <w:keepLines/>
-      <w:spacing w:before="200" w:after="120" w:line="276" w:lineRule="auto"/>
+      <w:spacing w:before="160" w:after="100" w:line="264" w:lineRule="auto"/>
       <w:outlineLvl w:val="1"/>
     </w:pPr>
     <w:rPr>
-      <w:rFonts w:asciiTheme="majorHAnsi" w:eastAsiaTheme="majorEastAsia" w:hAnsiTheme="majorHAnsi" w:cstheme="majorBidi" w:ascii="Arial" w:hAnsi="Arial"/>
+      <w:rFonts w:asciiTheme="majorHAnsi" w:eastAsiaTheme="majorEastAsia" w:hAnsiTheme="majorHAnsi" w:cstheme="majorBidi" w:ascii="DejaVu Sans" w:hAnsi="DejaVu Sans"/>
       <w:b/>
       <w:bCs/>
       <w:color w:val="000000"/>
-      <w:sz w:val="26"/>
+      <w:sz w:val="28"/>
       <w:szCs w:val="26"/>
     </w:rPr>
   </w:style>
@@ -2721,15 +2106,15 @@
     <w:qFormat/>
     <w:rsid w:val="00FC693F"/>
     <w:pPr>
-      <w:spacing w:after="120" w:line="276" w:lineRule="auto"/>
+      <w:spacing w:after="100" w:line="264" w:lineRule="auto" w:before="160"/>
       <w:contextualSpacing/>
     </w:pPr>
     <w:rPr>
-      <w:rFonts w:asciiTheme="majorHAnsi" w:eastAsiaTheme="majorEastAsia" w:hAnsiTheme="majorHAnsi" w:cstheme="majorBidi" w:ascii="Arial" w:hAnsi="Arial"/>
+      <w:rFonts w:asciiTheme="majorHAnsi" w:eastAsiaTheme="majorEastAsia" w:hAnsiTheme="majorHAnsi" w:cstheme="majorBidi" w:ascii="DejaVu Sans" w:hAnsi="DejaVu Sans"/>
       <w:color w:val="000000"/>
       <w:spacing w:val="5"/>
       <w:kern w:val="28"/>
-      <w:sz w:val="46"/>
+      <w:sz w:val="42"/>
       <w:szCs w:val="52"/>
     </w:rPr>
   </w:style>

</xml_diff>

<commit_message>
Make A1–A8 compulsory, add optional bonus and guided HolzBot practice exam
</commit_message>
<xml_diff>
--- a/lehrkraft-material/pruefung/erwartungshorizont.docx
+++ b/lehrkraft-material/pruefung/erwartungshorizont.docx
@@ -15,7 +15,7 @@
         <w:rPr>
           <w:b w:val="0"/>
         </w:rPr>
-        <w:t>Zur vierseitigen Lernerfolgskontrolle mit 30 Minuten Arbeitszeit und 30 Punkten. Erlaubt ist das gedruckte Material der Mappe. iPad und andere digitale Geräte sind ausgeschlossen.</w:t>
+        <w:t>Zur vierseitigen Lernerfolgskontrolle mit 30 Minuten Arbeitszeit, 28 Pflichtpunkten (A1 bis A8) und 4 freiwilligen Bonuspunkten (A9/A10). Erlaubt ist das gedruckte Material der Mappe. iPad und andere digitale Geräte sind ausgeschlossen.</w:t>
       </w:r>
     </w:p>
     <w:p>
@@ -31,7 +31,7 @@
         <w:rPr>
           <w:b w:val="0"/>
         </w:rPr>
-        <w:t>Die vier Seiten gemeinsam ausgeben. Orientierung: Aufgaben 1 und 2 etwa 7 Minuten, 3 und 4 etwa 8 Minuten, 5 und 6 etwa 7 Minuten, Aufgabe 7 etwa 5 Minuten, abschließende Kontrolle etwa 3 Minuten. Das Nachschlagen ist in diesen Planwerten enthalten; nach dem ersten Einsatz prüfen. Vereinbarte Nachteilsausgleiche beachten.</w:t>
+        <w:t>Die vier Seiten gemeinsam ausgeben. Orientierung: Aufgaben 1 und 2 etwa 7 Minuten, 3 und 4a bis 4c etwa 8 Minuten, 4d bis 6 etwa 7 Minuten, abschließende Pflichtkontrolle etwa 3 Minuten; verbleibende 5 Minuten optional für Bonusaufgabe 7. Das Nachschlagen ist in diesen Planwerten enthalten; nach dem ersten Einsatz prüfen. Vereinbarte Nachteilsausgleiche beachten.</w:t>
       </w:r>
     </w:p>
     <w:p>
@@ -47,6 +47,14 @@
         <w:rPr>
           <w:b w:val="0"/>
         </w:rPr>
+        <w:t>Pflichtteil und Bonus getrennt dokumentieren: Pflicht maximal 28 Punkte, Bonus maximal 4 Punkte. Auslassen der Bonusaufgabe mindert das Pflichtergebnis nicht. 32 Punkte sind kein Pflichtnenner. Die Bonusanrechnung bei einer Note wird vorab durch die Lehrkraft festgelegt; hier wird kein Notenschlüssel vorgegeben.</w:t>
+      </w:r>
+    </w:p>
+    <w:p>
+      <w:r>
+        <w:rPr>
+          <w:b w:val="0"/>
+        </w:rPr>
         <w:t>Sinngemäße Lückenfüllungen anerkennen. Rechtschreibfehler nicht abziehen, sofern der Fachbegriff eindeutig ist. Jeder Teil wird getrennt bewertet. Ein falsches Kreuz in 4a verhindert nicht den Punkt für eine fachlich passende Begründung in 4b. Kein automatisch abgeleiteter Notenschlüssel.</w:t>
       </w:r>
     </w:p>
@@ -55,7 +63,7 @@
         <w:rPr>
           <w:b w:val="0"/>
         </w:rPr>
-        <w:t>Einfachauswahl: Nur das richtige und kein weiteres Feld angekreuzt ergibt die genannten Punkte. Mehrfachauswahl 2c und 4c: je richtig gesetztem Kreuz 1 Punkt, je falsch gesetztem Kreuz 1 Punkt Abzug innerhalb der Teilaufgabe; mindestens 0, höchstens 2 Punkte. Nicht gesetzte Kreuze geben keine Punkte. Ein vollständig leeres Feld ergibt 0 Punkte. So wird nicht wahlloses Ankreuzen belohnt.</w:t>
+        <w:t>Einfachauswahl: Nur das richtige und kein weiteres Feld angekreuzt ergibt die genannten Punkte. Mehrfachauswahl 2c, 4c und 4d: je richtig gesetztem Kreuz 1 Punkt, je falsch gesetztem Kreuz 1 Punkt Abzug innerhalb der Teilaufgabe; mindestens 0, höchstens 2 Punkte. Nicht gesetzte Kreuze geben keine Punkte. Ein vollständig leeres Feld ergibt 0 Punkte. So wird nicht wahlloses Ankreuzen belohnt.</w:t>
       </w:r>
     </w:p>
     <w:p>
@@ -71,7 +79,7 @@
         <w:pStyle w:val="Heading2"/>
       </w:pPr>
       <w:r>
-        <w:t>1 Aufbau des Stamms   4 Punkte</w:t>
+        <w:t>1 Aufbau des Stamms A1   4 Punkte</w:t>
       </w:r>
     </w:p>
     <w:p>
@@ -103,7 +111,7 @@
         <w:pStyle w:val="Heading2"/>
       </w:pPr>
       <w:r>
-        <w:t>3 Produktionsweg und Schnittplan   6 Punkte</w:t>
+        <w:t>3 Produktionsweg und Schnittplan A3 A4   6 Punkte</w:t>
       </w:r>
     </w:p>
     <w:p>
@@ -119,7 +127,7 @@
         <w:pStyle w:val="Heading2"/>
       </w:pPr>
       <w:r>
-        <w:t>4 Holzproben   4 Punkte</w:t>
+        <w:t>4 Holzproben   6 Punkte</w:t>
       </w:r>
     </w:p>
     <w:p>
@@ -127,7 +135,7 @@
         <w:rPr>
           <w:b w:val="0"/>
         </w:rPr>
-        <w:t>4a Probe Q: 1 P. 4b kaum: 1 P. 4c Erste und dritte Aussage: Größere Masse kann durch größeres Volumen entstehen; gleiche Größe und ähnliche Trockenheit erlauben einen fairen Vergleich; bis 2 P nach Mehrfachregel.</w:t>
+        <w:t>4a Probe Q: 1 P. 4b kaum: 1 P. 4c Erste und dritte Aussage: Größere Masse kann durch größeres Volumen entstehen; gleiche Größe und ähnliche Trockenheit erlauben einen fairen Vergleich; bis 2 P nach Mehrfachregel. 4d Erste und zweite Aussage: Glätte ohne Splitter ist für häufiges Anfassen günstig; geringe Wasseraufnahme ist bei wechselnder Feuchte günstig. Eine tiefe Druckspur spricht für geringere Härte. Bis 2 P nach Mehrfachregel.</w:t>
       </w:r>
     </w:p>
     <w:p>
@@ -148,7 +156,7 @@
         <w:pStyle w:val="Heading2"/>
       </w:pPr>
       <w:r>
-        <w:t>5 Holz arbeitet   4 Punkte</w:t>
+        <w:t>5 Holz arbeitet A7   4 Punkte</w:t>
       </w:r>
     </w:p>
     <w:p>
@@ -180,7 +188,7 @@
         <w:pStyle w:val="Heading2"/>
       </w:pPr>
       <w:r>
-        <w:t>7 Materialentscheidung   4 Punkte</w:t>
+        <w:t>7 Freiwilliger Bonus A9 A10   4 Bonuspunkte</w:t>
       </w:r>
     </w:p>
     <w:p>
@@ -411,7 +419,7 @@
                 <w:b w:val="0"/>
                 <w:sz w:val="21"/>
               </w:rPr>
-              <w:t>Ringbreite deuten (2b), Schnittbreite erklären (3b), Härte aus Druckspur ableiten (4a/b), Trocknungsdaten erklären (5a), Eigenschaften mit Auftrag verbinden (7b/c)</w:t>
+              <w:t>Ringbreite deuten (2b), Schnittbreite erklären (3b), Härte aus Druckspur ableiten (4a/b), Trocknungsdaten erklären (5a), Beobachtung mit Verwendung verbinden (4d); optional: Eigenschaften mit Auftrag verbinden (7b/c)</w:t>
             </w:r>
           </w:p>
         </w:tc>
@@ -476,7 +484,7 @@
                 <w:b w:val="0"/>
                 <w:sz w:val="21"/>
               </w:rPr>
-              <w:t>Folge einer Bastschädigung ableiten (1b), Grenze einer Aussage prüfen (2c), Mindestbreite gegen Ausbeute abwägen (3c), Vergleichsbedingungen prüfen (4c), Vorsorge übertragen (5b), Verwendbarkeit beurteilen (6b), mehrere Anforderungen abwägen (7a)</w:t>
+              <w:t>Folge einer Bastschädigung ableiten (1b), Grenze einer Aussage prüfen (2c), Mindestbreite gegen Ausbeute abwägen (3c), Vergleichsbedingungen prüfen (4c), Vorsorge übertragen (5b), Verwendbarkeit beurteilen (6b), optional: mehrere Anforderungen abwägen (7a)</w:t>
             </w:r>
           </w:p>
         </w:tc>
@@ -516,7 +524,7 @@
         <w:rPr>
           <w:b w:val="0"/>
         </w:rPr>
-        <w:t>Punkte: ______ / 30</w:t>
+        <w:t>Pflichtpunkte: ______ / 28    Freiwilliger Bonus: ______ / 4</w:t>
       </w:r>
     </w:p>
     <w:tbl>
@@ -975,7 +983,7 @@
                 <w:b w:val="0"/>
                 <w:sz w:val="21"/>
               </w:rPr>
-              <w:t>____ / 4</w:t>
+              <w:t>____ / 6</w:t>
             </w:r>
           </w:p>
         </w:tc>
@@ -1230,7 +1238,7 @@
                 <w:b w:val="0"/>
                 <w:sz w:val="21"/>
               </w:rPr>
-              <w:t>Materialentscheidung</w:t>
+              <w:t>Freiwilliger Bonus</w:t>
             </w:r>
           </w:p>
         </w:tc>
@@ -1290,7 +1298,7 @@
                 <w:b w:val="0"/>
                 <w:sz w:val="21"/>
               </w:rPr>
-              <w:t>A9 und A10</w:t>
+              <w:t>A9 und A10 (optional)</w:t>
             </w:r>
           </w:p>
         </w:tc>
@@ -1751,12 +1759,12 @@
     <w:qFormat/>
     <w:rsid w:val="00FC693F"/>
     <w:pPr>
-      <w:spacing w:line="264" w:lineRule="auto" w:after="100" w:before="0"/>
+      <w:spacing w:line="240" w:lineRule="auto" w:after="60" w:before="0"/>
     </w:pPr>
     <w:rPr>
       <w:rFonts w:ascii="DejaVu Sans" w:hAnsi="DejaVu Sans"/>
       <w:color w:val="000000"/>
-      <w:sz w:val="22"/>
+      <w:sz w:val="21"/>
     </w:rPr>
   </w:style>
   <w:style w:type="paragraph" w:styleId="Header">
@@ -1844,7 +1852,7 @@
     <w:pPr>
       <w:keepNext/>
       <w:keepLines/>
-      <w:spacing w:before="160" w:after="100" w:line="264" w:lineRule="auto"/>
+      <w:spacing w:before="120" w:after="100" w:line="264" w:lineRule="auto"/>
       <w:outlineLvl w:val="1"/>
     </w:pPr>
     <w:rPr>
@@ -1852,7 +1860,7 @@
       <w:b/>
       <w:bCs/>
       <w:color w:val="000000"/>
-      <w:sz w:val="28"/>
+      <w:sz w:val="26"/>
       <w:szCs w:val="26"/>
     </w:rPr>
   </w:style>

</xml_diff>